<commit_message>
Phụ lục 3, 4: bỏ chẩn đoán điện; viết lại Bài 5–7 dạng khung an toàn theo Mục 4, 5
Co-Authored-By: Claude Opus 5.5 <noreply@anthropic.com>
Claude-Session: https://claude.ai/code/session_01PghSfXrPdMgJKuyFrSYQXT
</commit_message>
<xml_diff>
--- a/DCCT_Phuong_thuc_tri_lieu/Phu_luc_3_4_Phuong_thuc_tri_lieu_2026.docx
+++ b/DCCT_Phuong_thuc_tri_lieu/Phu_luc_3_4_Phuong_thuc_tri_lieu_2026.docx
@@ -1309,7 +1309,7 @@
           <w:sz w:val="26"/>
           <w:szCs w:val="26"/>
         </w:rPr>
-        <w:t xml:space="preserve">Bài học trình bày ba nội dung: kích thích điện thần kinh – cơ (kích thích điện, các dòng điện kích thích, kỹ thuật điều trị); chẩn đoán điện (hoạt động điện của các dây thần kinh, điện chẩn đoán); các dòng điện giảm đau (dòng siêu kích thích điện, dòng TENS, dòng Diadynamic, dòng giao thoa). Sinh viên tìm hiểu các tác dụng sinh lý, tác dụng điều trị, ứng dụng lâm sàng, cách lựa chọn dòng điện trong điều trị kích thích cơ và cách xác định vị trí đặt điện cực kích thích, làm cơ sở để thực hiện đúng kỹ thuật điều trị bằng điện cực điểm và bằng điện cực tấm.</w:t>
+        <w:t xml:space="preserve">Bài học trình bày hai nội dung: kích thích điện thần kinh – cơ (kích thích điện, các dòng điện kích thích, kỹ thuật điều trị); các dòng điện giảm đau (dòng siêu kích thích điện, dòng TENS, dòng Diadynamic, dòng giao thoa). Sinh viên tìm hiểu các tác dụng sinh lý, tác dụng điều trị, ứng dụng lâm sàng, cách lựa chọn dòng điện trong điều trị kích thích cơ và cách xác định vị trí đặt điện cực kích thích, làm cơ sở để thực hiện đúng kỹ thuật điều trị bằng điện cực điểm và bằng điện cực tấm.</w:t>
       </w:r>
     </w:p>
     <w:p>
@@ -1398,25 +1398,6 @@
           <w:sz w:val="26"/>
           <w:szCs w:val="26"/>
         </w:rPr>
-        <w:t xml:space="preserve">Chẩn đoán điện: hoạt động điện của các dây thần kinh; điện chẩn đoán.</w:t>
-      </w:r>
-    </w:p>
-    <w:p>
-      <w:pPr>
-        <w:pStyle w:val="ListParagraph"/>
-        <w:numPr>
-          <w:ilvl w:val="0"/>
-          <w:numId w:val="2"/>
-        </w:numPr>
-        <w:spacing w:after="40" w:line="312"/>
-        <w:jc w:val="both"/>
-      </w:pPr>
-      <w:r>
-        <w:rPr>
-          <w:rFonts w:ascii="Times New Roman" w:cs="Times New Roman" w:eastAsia="Times New Roman" w:hAnsi="Times New Roman"/>
-          <w:sz w:val="26"/>
-          <w:szCs w:val="26"/>
-        </w:rPr>
         <w:t xml:space="preserve">Các dòng điện giảm đau: dòng siêu kích thích điện, dòng TENS, dòng Diadynamic, dòng giao thoa.</w:t>
       </w:r>
     </w:p>
@@ -1601,7 +1582,7 @@
           <w:sz w:val="26"/>
           <w:szCs w:val="26"/>
         </w:rPr>
-        <w:t xml:space="preserve">Kích thích điện thần kinh – cơ; Dòng điện kích thích; Chẩn đoán điện; Hoạt động điện của dây thần kinh; Dòng siêu kích thích điện; Dòng TENS; Dòng Diadynamic; Dòng giao thoa; Điện cực điểm; Điện cực tấm; Vị trí đặt điện cực</w:t>
+        <w:t xml:space="preserve">Kích thích điện thần kinh – cơ; Dòng điện kích thích; Dòng siêu kích thích điện; Dòng TENS; Dòng Diadynamic; Dòng giao thoa; Điện cực điểm; Điện cực tấm; Vị trí đặt điện cực</w:t>
       </w:r>
     </w:p>
     <w:p>
@@ -1656,25 +1637,6 @@
           <w:sz w:val="26"/>
           <w:szCs w:val="26"/>
         </w:rPr>
-        <w:t xml:space="preserve">Trình bày hoạt động điện của các dây thần kinh và điện chẩn đoán.</w:t>
-      </w:r>
-    </w:p>
-    <w:p>
-      <w:pPr>
-        <w:pStyle w:val="ListParagraph"/>
-        <w:numPr>
-          <w:ilvl w:val="0"/>
-          <w:numId w:val="2"/>
-        </w:numPr>
-        <w:spacing w:after="40" w:line="312"/>
-        <w:jc w:val="both"/>
-      </w:pPr>
-      <w:r>
-        <w:rPr>
-          <w:rFonts w:ascii="Times New Roman" w:cs="Times New Roman" w:eastAsia="Times New Roman" w:hAnsi="Times New Roman"/>
-          <w:sz w:val="26"/>
-          <w:szCs w:val="26"/>
-        </w:rPr>
         <w:t xml:space="preserve">Trình bày các dòng điện giảm đau: dòng siêu kích thích điện, TENS, Diadynamic, giao thoa.</w:t>
       </w:r>
     </w:p>
@@ -2517,7 +2479,7 @@
           <w:sz w:val="26"/>
           <w:szCs w:val="26"/>
         </w:rPr>
-        <w:t xml:space="preserve">Bài học mở đầu phần kỹ thuật tác động mô mềm, giới thiệu khái niệm xoa bóp tại chỗ, các tác dụng cơ học, phản xạ, tuần hoàn, thần kinh và tâm lý, từ đó dẫn đến tác dụng điều trị: giảm đau, giảm co cứng cơ, tăng hồi lưu tĩnh mạch – bạch huyết, giảm phù nề và tạo thư giãn. Sinh viên phân tích chỉ định, chống chỉ định, nguyên tắc áp dụng và tìm hiểu các thao tác cơ bản: vuốt, xoa (xát), nhào, vỗ – gõ, rung. Bài học giúp sinh viên lựa chọn thao tác phù hợp với tình trạng người bệnh và thực hiện đúng quy trình với sự tôn trọng, giao tiếp phù hợp.</w:t>
+        <w:t xml:space="preserve">Bài học trình bày khái niệm xoa bóp tại chỗ, các tác dụng sinh lý và tác dụng điều trị; chỉ định, chống chỉ định và nguyên tắc áp dụng; các thao tác xoa bóp cơ bản và quy trình thực hiện. Bài học giúp sinh viên lựa chọn thao tác xoa bóp phù hợp với tình trạng và đáp ứng của người bệnh, làm cơ sở để thực hiện đúng các thao tác theo quy trình trên người bệnh giả định.</w:t>
       </w:r>
     </w:p>
     <w:p>
@@ -2549,45 +2511,26 @@
           <w:sz w:val="26"/>
           <w:szCs w:val="26"/>
         </w:rPr>
-        <w:t xml:space="preserve">Sinh viên đọc kỹ giáo trình Các phương thức điều trị Vật lý trị liệu II, mục tiêu bài học và các yêu cầu thực hành. Trước khi học, sinh viên cần nắm:</w:t>
-      </w:r>
-    </w:p>
-    <w:p>
-      <w:pPr>
-        <w:pStyle w:val="ListParagraph"/>
-        <w:numPr>
-          <w:ilvl w:val="0"/>
-          <w:numId w:val="2"/>
-        </w:numPr>
-        <w:spacing w:after="40" w:line="312"/>
-        <w:jc w:val="both"/>
-      </w:pPr>
-      <w:r>
-        <w:rPr>
-          <w:rFonts w:ascii="Times New Roman" w:cs="Times New Roman" w:eastAsia="Times New Roman" w:hAnsi="Times New Roman"/>
-          <w:sz w:val="26"/>
-          <w:szCs w:val="26"/>
-        </w:rPr>
-        <w:t xml:space="preserve">Giải phẫu bề mặt và hướng thớ của các nhóm cơ lớn: cơ thang, cơ cạnh sống, cơ tứ đầu, cơ tam đầu cẳng chân.</w:t>
-      </w:r>
-    </w:p>
-    <w:p>
-      <w:pPr>
-        <w:pStyle w:val="ListParagraph"/>
-        <w:numPr>
-          <w:ilvl w:val="0"/>
-          <w:numId w:val="2"/>
-        </w:numPr>
-        <w:spacing w:after="40" w:line="312"/>
-        <w:jc w:val="both"/>
-      </w:pPr>
-      <w:r>
-        <w:rPr>
-          <w:rFonts w:ascii="Times New Roman" w:cs="Times New Roman" w:eastAsia="Times New Roman" w:hAnsi="Times New Roman"/>
-          <w:sz w:val="26"/>
-          <w:szCs w:val="26"/>
-        </w:rPr>
-        <w:t xml:space="preserve">Sinh lý tuần hoàn tĩnh mạch và bạch huyết.</w:t>
+        <w:t xml:space="preserve">Sinh viên đọc, nghiên cứu giáo trình Các phương thức điều trị Vật lý trị liệu II trước ở nhà, mục tiêu bài học và quy trình kỹ thuật. Trước khi học, sinh viên cần nắm:</w:t>
+      </w:r>
+    </w:p>
+    <w:p>
+      <w:pPr>
+        <w:pStyle w:val="ListParagraph"/>
+        <w:numPr>
+          <w:ilvl w:val="0"/>
+          <w:numId w:val="2"/>
+        </w:numPr>
+        <w:spacing w:after="40" w:line="312"/>
+        <w:jc w:val="both"/>
+      </w:pPr>
+      <w:r>
+        <w:rPr>
+          <w:rFonts w:ascii="Times New Roman" w:cs="Times New Roman" w:eastAsia="Times New Roman" w:hAnsi="Times New Roman"/>
+          <w:sz w:val="26"/>
+          <w:szCs w:val="26"/>
+        </w:rPr>
+        <w:t xml:space="preserve">Khái niệm xoa bóp tại chỗ.</w:t>
       </w:r>
     </w:p>
     <w:p>
@@ -2625,26 +2568,26 @@
           <w:sz w:val="26"/>
           <w:szCs w:val="26"/>
         </w:rPr>
-        <w:t xml:space="preserve">Chỉ định, chống chỉ định và nguyên tắc áp dụng (tư thế, hướng, lực, nhịp độ, thời gian).</w:t>
-      </w:r>
-    </w:p>
-    <w:p>
-      <w:pPr>
-        <w:pStyle w:val="ListParagraph"/>
-        <w:numPr>
-          <w:ilvl w:val="0"/>
-          <w:numId w:val="2"/>
-        </w:numPr>
-        <w:spacing w:after="40" w:line="312"/>
-        <w:jc w:val="both"/>
-      </w:pPr>
-      <w:r>
-        <w:rPr>
-          <w:rFonts w:ascii="Times New Roman" w:cs="Times New Roman" w:eastAsia="Times New Roman" w:hAnsi="Times New Roman"/>
-          <w:sz w:val="26"/>
-          <w:szCs w:val="26"/>
-        </w:rPr>
-        <w:t xml:space="preserve">Cách thực hiện và tác dụng chủ yếu của 5 thao tác: vuốt, xoa, nhào, vỗ – gõ, rung.</w:t>
+        <w:t xml:space="preserve">Chỉ định, chống chỉ định và nguyên tắc áp dụng.</w:t>
+      </w:r>
+    </w:p>
+    <w:p>
+      <w:pPr>
+        <w:pStyle w:val="ListParagraph"/>
+        <w:numPr>
+          <w:ilvl w:val="0"/>
+          <w:numId w:val="2"/>
+        </w:numPr>
+        <w:spacing w:after="40" w:line="312"/>
+        <w:jc w:val="both"/>
+      </w:pPr>
+      <w:r>
+        <w:rPr>
+          <w:rFonts w:ascii="Times New Roman" w:cs="Times New Roman" w:eastAsia="Times New Roman" w:hAnsi="Times New Roman"/>
+          <w:sz w:val="26"/>
+          <w:szCs w:val="26"/>
+        </w:rPr>
+        <w:t xml:space="preserve">Các thao tác xoa bóp cơ bản và quy trình thực hiện.</w:t>
       </w:r>
     </w:p>
     <w:p>
@@ -2674,7 +2617,7 @@
           <w:sz w:val="26"/>
           <w:szCs w:val="26"/>
         </w:rPr>
-        <w:t xml:space="preserve">Sinh viên quan sát các hình thức xoa bóp trong cộng đồng (spa, xoa bóp dân gian) và phân biệt với xoa bóp trị liệu về mục tiêu, chỉ định và an toàn.</w:t>
+        <w:t xml:space="preserve">Sinh viên vẽ sơ đồ tư duy liên hệ nội dung bài học với các kiến thức giải phẫu, sinh lý đã học và với các phương thức điều trị vật lý khác trong học phần.</w:t>
       </w:r>
     </w:p>
     <w:p>
@@ -2709,45 +2652,26 @@
           <w:sz w:val="26"/>
           <w:szCs w:val="26"/>
         </w:rPr>
-        <w:t xml:space="preserve">Người bệnh phù nề cổ chân sau tháo bột gãy xương cẳng chân.</w:t>
-      </w:r>
-    </w:p>
-    <w:p>
-      <w:pPr>
-        <w:pStyle w:val="ListParagraph"/>
-        <w:numPr>
-          <w:ilvl w:val="0"/>
-          <w:numId w:val="2"/>
-        </w:numPr>
-        <w:spacing w:after="40" w:line="312"/>
-        <w:jc w:val="both"/>
-      </w:pPr>
-      <w:r>
-        <w:rPr>
-          <w:rFonts w:ascii="Times New Roman" w:cs="Times New Roman" w:eastAsia="Times New Roman" w:hAnsi="Times New Roman"/>
-          <w:sz w:val="26"/>
-          <w:szCs w:val="26"/>
-        </w:rPr>
-        <w:t xml:space="preserve">Người bệnh sưng, nóng, đau bắp chân một bên 3 ngày sau phẫu thuật.</w:t>
-      </w:r>
-    </w:p>
-    <w:p>
-      <w:pPr>
-        <w:pStyle w:val="ListParagraph"/>
-        <w:numPr>
-          <w:ilvl w:val="0"/>
-          <w:numId w:val="2"/>
-        </w:numPr>
-        <w:spacing w:after="40" w:line="312"/>
-        <w:jc w:val="both"/>
-      </w:pPr>
-      <w:r>
-        <w:rPr>
-          <w:rFonts w:ascii="Times New Roman" w:cs="Times New Roman" w:eastAsia="Times New Roman" w:hAnsi="Times New Roman"/>
-          <w:sz w:val="26"/>
-          <w:szCs w:val="26"/>
-        </w:rPr>
-        <w:t xml:space="preserve">Vận động viên căng cơ đùi sau thi đấu.</w:t>
+        <w:t xml:space="preserve">Lên danh sách các bệnh/tình trạng được chỉ định xoa bóp tại chỗ.</w:t>
+      </w:r>
+    </w:p>
+    <w:p>
+      <w:pPr>
+        <w:pStyle w:val="ListParagraph"/>
+        <w:numPr>
+          <w:ilvl w:val="0"/>
+          <w:numId w:val="2"/>
+        </w:numPr>
+        <w:spacing w:after="40" w:line="312"/>
+        <w:jc w:val="both"/>
+      </w:pPr>
+      <w:r>
+        <w:rPr>
+          <w:rFonts w:ascii="Times New Roman" w:cs="Times New Roman" w:eastAsia="Times New Roman" w:hAnsi="Times New Roman"/>
+          <w:sz w:val="26"/>
+          <w:szCs w:val="26"/>
+        </w:rPr>
+        <w:t xml:space="preserve">Những trường hợp nào không được xoa bóp?</w:t>
       </w:r>
     </w:p>
     <w:p>
@@ -2809,7 +2733,7 @@
           <w:sz w:val="26"/>
           <w:szCs w:val="26"/>
         </w:rPr>
-        <w:t xml:space="preserve">Xoa bóp trị liệu; Vuốt (effleurage); Xoa – xát (friction); Nhào (petrissage); Vỗ – gõ (tapotement); Rung (vibration); Hồi lưu tĩnh mạch – bạch huyết; Huyết khối tĩnh mạch sâu</w:t>
+        <w:t xml:space="preserve">Xoa bóp tại chỗ; Tác dụng sinh lý; Tác dụng điều trị; Chỉ định; Chống chỉ định; Nguyên tắc áp dụng; Thao tác xoa bóp cơ bản; Quy trình kỹ thuật</w:t>
       </w:r>
     </w:p>
     <w:p>
@@ -2845,7 +2769,45 @@
           <w:sz w:val="26"/>
           <w:szCs w:val="26"/>
         </w:rPr>
-        <w:t xml:space="preserve">Phân tích các tác dụng sinh lý của xoa bóp và liên hệ với tác dụng điều trị.</w:t>
+        <w:t xml:space="preserve">Trình bày khái niệm xoa bóp tại chỗ.</w:t>
+      </w:r>
+    </w:p>
+    <w:p>
+      <w:pPr>
+        <w:pStyle w:val="ListParagraph"/>
+        <w:numPr>
+          <w:ilvl w:val="0"/>
+          <w:numId w:val="2"/>
+        </w:numPr>
+        <w:spacing w:after="40" w:line="312"/>
+        <w:jc w:val="both"/>
+      </w:pPr>
+      <w:r>
+        <w:rPr>
+          <w:rFonts w:ascii="Times New Roman" w:cs="Times New Roman" w:eastAsia="Times New Roman" w:hAnsi="Times New Roman"/>
+          <w:sz w:val="26"/>
+          <w:szCs w:val="26"/>
+        </w:rPr>
+        <w:t xml:space="preserve">Trình bày tác dụng sinh lý và tác dụng điều trị của xoa bóp.</w:t>
+      </w:r>
+    </w:p>
+    <w:p>
+      <w:pPr>
+        <w:pStyle w:val="ListParagraph"/>
+        <w:numPr>
+          <w:ilvl w:val="0"/>
+          <w:numId w:val="2"/>
+        </w:numPr>
+        <w:spacing w:after="40" w:line="312"/>
+        <w:jc w:val="both"/>
+      </w:pPr>
+      <w:r>
+        <w:rPr>
+          <w:rFonts w:ascii="Times New Roman" w:cs="Times New Roman" w:eastAsia="Times New Roman" w:hAnsi="Times New Roman"/>
+          <w:sz w:val="26"/>
+          <w:szCs w:val="26"/>
+        </w:rPr>
+        <w:t xml:space="preserve">Kể các chỉ định và chống chỉ định của xoa bóp.</w:t>
       </w:r>
     </w:p>
     <w:p>
@@ -2883,45 +2845,7 @@
           <w:sz w:val="26"/>
           <w:szCs w:val="26"/>
         </w:rPr>
-        <w:t xml:space="preserve">So sánh 5 thao tác xoa bóp cơ bản về cách thực hiện và tác dụng chủ yếu.</w:t>
-      </w:r>
-    </w:p>
-    <w:p>
-      <w:pPr>
-        <w:pStyle w:val="ListParagraph"/>
-        <w:numPr>
-          <w:ilvl w:val="0"/>
-          <w:numId w:val="2"/>
-        </w:numPr>
-        <w:spacing w:after="40" w:line="312"/>
-        <w:jc w:val="both"/>
-      </w:pPr>
-      <w:r>
-        <w:rPr>
-          <w:rFonts w:ascii="Times New Roman" w:cs="Times New Roman" w:eastAsia="Times New Roman" w:hAnsi="Times New Roman"/>
-          <w:sz w:val="26"/>
-          <w:szCs w:val="26"/>
-        </w:rPr>
-        <w:t xml:space="preserve">Vì sao không xoa bóp chi có nghi ngờ huyết khối tĩnh mạch sâu?</w:t>
-      </w:r>
-    </w:p>
-    <w:p>
-      <w:pPr>
-        <w:pStyle w:val="ListParagraph"/>
-        <w:numPr>
-          <w:ilvl w:val="0"/>
-          <w:numId w:val="2"/>
-        </w:numPr>
-        <w:spacing w:after="40" w:line="312"/>
-        <w:jc w:val="both"/>
-      </w:pPr>
-      <w:r>
-        <w:rPr>
-          <w:rFonts w:ascii="Times New Roman" w:cs="Times New Roman" w:eastAsia="Times New Roman" w:hAnsi="Times New Roman"/>
-          <w:sz w:val="26"/>
-          <w:szCs w:val="26"/>
-        </w:rPr>
-        <w:t xml:space="preserve">Thao tác vuốt nhằm giảm phù nề cần thực hiện theo hướng nào? Giải thích.</w:t>
+        <w:t xml:space="preserve">Kể tên các thao tác xoa bóp cơ bản và quy trình thực hiện.</w:t>
       </w:r>
     </w:p>
     <w:p>
@@ -2968,7 +2892,7 @@
           <w:sz w:val="26"/>
           <w:szCs w:val="26"/>
         </w:rPr>
-        <w:t xml:space="preserve">Nữ 30 tuổi, vừa tháo bột cẳng – bàn chân phải sau 6 tuần điều trị gãy kín 1/3 dưới xương chày đã liền xương. Cổ chân và bàn chân phù nhẹ, cơ bắp chân teo và căng, da khô, không có dấu hiệu viêm; siêu âm Doppler đã loại trừ huyết khối tĩnh mạch sâu.</w:t>
+        <w:t xml:space="preserve">Một bệnh nhân giả định được chỉ định xoa bóp tại chỗ tại phòng thực hành.</w:t>
       </w:r>
     </w:p>
     <w:p>
@@ -3002,45 +2926,45 @@
           <w:sz w:val="26"/>
           <w:szCs w:val="26"/>
         </w:rPr>
-        <w:t xml:space="preserve">Xác định mục tiêu xoa bóp cho người bệnh.</w:t>
-      </w:r>
-    </w:p>
-    <w:p>
-      <w:pPr>
-        <w:pStyle w:val="ListParagraph"/>
-        <w:numPr>
-          <w:ilvl w:val="0"/>
-          <w:numId w:val="2"/>
-        </w:numPr>
-        <w:spacing w:after="40" w:line="312"/>
-        <w:jc w:val="both"/>
-      </w:pPr>
-      <w:r>
-        <w:rPr>
-          <w:rFonts w:ascii="Times New Roman" w:cs="Times New Roman" w:eastAsia="Times New Roman" w:hAnsi="Times New Roman"/>
-          <w:sz w:val="26"/>
-          <w:szCs w:val="26"/>
-        </w:rPr>
-        <w:t xml:space="preserve">Lựa chọn thao tác, hướng, lực và trình tự thực hiện; giải thích.</w:t>
-      </w:r>
-    </w:p>
-    <w:p>
-      <w:pPr>
-        <w:pStyle w:val="ListParagraph"/>
-        <w:numPr>
-          <w:ilvl w:val="0"/>
-          <w:numId w:val="2"/>
-        </w:numPr>
-        <w:spacing w:after="40" w:line="312"/>
-        <w:jc w:val="both"/>
-      </w:pPr>
-      <w:r>
-        <w:rPr>
-          <w:rFonts w:ascii="Times New Roman" w:cs="Times New Roman" w:eastAsia="Times New Roman" w:hAnsi="Times New Roman"/>
-          <w:sz w:val="26"/>
-          <w:szCs w:val="26"/>
-        </w:rPr>
-        <w:t xml:space="preserve">Nêu các điểm cần chú ý về giao tiếp, tư thế và bảo đảm kín đáo cho người bệnh.</w:t>
+        <w:t xml:space="preserve">Liệt kê các chống chỉ định cần kiểm tra trước khi thực hiện.</w:t>
+      </w:r>
+    </w:p>
+    <w:p>
+      <w:pPr>
+        <w:pStyle w:val="ListParagraph"/>
+        <w:numPr>
+          <w:ilvl w:val="0"/>
+          <w:numId w:val="2"/>
+        </w:numPr>
+        <w:spacing w:after="40" w:line="312"/>
+        <w:jc w:val="both"/>
+      </w:pPr>
+      <w:r>
+        <w:rPr>
+          <w:rFonts w:ascii="Times New Roman" w:cs="Times New Roman" w:eastAsia="Times New Roman" w:hAnsi="Times New Roman"/>
+          <w:sz w:val="26"/>
+          <w:szCs w:val="26"/>
+        </w:rPr>
+        <w:t xml:space="preserve">Lựa chọn thao tác xoa bóp phù hợp và giải thích.</w:t>
+      </w:r>
+    </w:p>
+    <w:p>
+      <w:pPr>
+        <w:pStyle w:val="ListParagraph"/>
+        <w:numPr>
+          <w:ilvl w:val="0"/>
+          <w:numId w:val="2"/>
+        </w:numPr>
+        <w:spacing w:after="40" w:line="312"/>
+        <w:jc w:val="both"/>
+      </w:pPr>
+      <w:r>
+        <w:rPr>
+          <w:rFonts w:ascii="Times New Roman" w:cs="Times New Roman" w:eastAsia="Times New Roman" w:hAnsi="Times New Roman"/>
+          <w:sz w:val="26"/>
+          <w:szCs w:val="26"/>
+        </w:rPr>
+        <w:t xml:space="preserve">Trình bày các bước thực hiện kỹ thuật: chào hỏi, giao tiếp, kiểm tra thông tin người bệnh; hướng dẫn, giải thích kỹ thuật; đặt tư thế người bệnh và tư thế kỹ thuật viên; bộc lộ vùng điều trị; thực hiện kỹ thuật; theo dõi và xử trí khi người bệnh phản hồi cảm giác; kết thúc điều trị.</w:t>
       </w:r>
     </w:p>
     <w:p>
@@ -3089,7 +3013,7 @@
           <w:sz w:val="26"/>
           <w:szCs w:val="26"/>
         </w:rPr>
-        <w:t xml:space="preserve">Bài học trình bày khái niệm điểm kích hoạt – nốt tăng nhạy cảm nằm trong dải cơ căng, khi ấn gây đau tại chỗ và đau quy chiếu đặc trưng; phân biệt điểm kích hoạt hoạt động và tiềm ẩn; cách xác định bằng sờ dẹt và sờ kẹp. Trên cơ sở đó, sinh viên tìm hiểu cơ chế tác dụng, chỉ định, chống chỉ định, tai biến và kỹ thuật của hai nhóm thao tác tác động lên điểm kích hoạt: nén – day điểm kích hoạt và trượt dọc theo thớ cơ ở các nhóm cơ chính. Bài học giúp sinh viên xác định điểm kích hoạt, lựa chọn kỹ thuật phù hợp với đáp ứng của người bệnh và thực hiện an toàn, có giao tiếp và theo dõi người bệnh.</w:t>
+        <w:t xml:space="preserve">Bài học trình bày khái niệm, đặc điểm và cách xác định điểm kích hoạt; cơ chế tác dụng, chỉ định, chống chỉ định và tai biến của kỹ thuật nén, day điểm kích hoạt và kỹ thuật trượt dọc theo thớ cơ; kỹ thuật nén và day điểm kích hoạt, kỹ thuật trượt dọc theo thớ cơ ở các nhóm cơ chính. Bài học giúp sinh viên lựa chọn kỹ thuật phù hợp với đáp ứng của người bệnh, làm cơ sở để thực hiện đúng kỹ thuật trên người bệnh giả định.</w:t>
       </w:r>
     </w:p>
     <w:p>
@@ -3121,121 +3045,121 @@
           <w:sz w:val="26"/>
           <w:szCs w:val="26"/>
         </w:rPr>
-        <w:t xml:space="preserve">Sinh viên đọc kỹ giáo trình Các phương thức điều trị Vật lý trị liệu II, mục tiêu bài học và các yêu cầu thực hành. Trước khi học, sinh viên cần nắm:</w:t>
-      </w:r>
-    </w:p>
-    <w:p>
-      <w:pPr>
-        <w:pStyle w:val="ListParagraph"/>
-        <w:numPr>
-          <w:ilvl w:val="0"/>
-          <w:numId w:val="2"/>
-        </w:numPr>
-        <w:spacing w:after="40" w:line="312"/>
-        <w:jc w:val="both"/>
-      </w:pPr>
-      <w:r>
-        <w:rPr>
-          <w:rFonts w:ascii="Times New Roman" w:cs="Times New Roman" w:eastAsia="Times New Roman" w:hAnsi="Times New Roman"/>
-          <w:sz w:val="26"/>
-          <w:szCs w:val="26"/>
-        </w:rPr>
-        <w:t xml:space="preserve">Giải phẫu nguyên ủy, bám tận, hướng thớ của cơ thang trên, cơ nâng vai, cơ dưới gai, cơ cạnh sống, cơ mông nhỡ, cơ bụng chân.</w:t>
-      </w:r>
-    </w:p>
-    <w:p>
-      <w:pPr>
-        <w:pStyle w:val="ListParagraph"/>
-        <w:numPr>
-          <w:ilvl w:val="0"/>
-          <w:numId w:val="2"/>
-        </w:numPr>
-        <w:spacing w:after="40" w:line="312"/>
-        <w:jc w:val="both"/>
-      </w:pPr>
-      <w:r>
-        <w:rPr>
-          <w:rFonts w:ascii="Times New Roman" w:cs="Times New Roman" w:eastAsia="Times New Roman" w:hAnsi="Times New Roman"/>
-          <w:sz w:val="26"/>
-          <w:szCs w:val="26"/>
-        </w:rPr>
-        <w:t xml:space="preserve">Định nghĩa, đặc điểm lâm sàng và tiêu chuẩn xác định điểm kích hoạt; phân biệt điểm kích hoạt hoạt động và tiềm ẩn.</w:t>
-      </w:r>
-    </w:p>
-    <w:p>
-      <w:pPr>
-        <w:pStyle w:val="ListParagraph"/>
-        <w:numPr>
-          <w:ilvl w:val="0"/>
-          <w:numId w:val="2"/>
-        </w:numPr>
-        <w:spacing w:after="40" w:line="312"/>
-        <w:jc w:val="both"/>
-      </w:pPr>
-      <w:r>
-        <w:rPr>
-          <w:rFonts w:ascii="Times New Roman" w:cs="Times New Roman" w:eastAsia="Times New Roman" w:hAnsi="Times New Roman"/>
-          <w:sz w:val="26"/>
-          <w:szCs w:val="26"/>
-        </w:rPr>
-        <w:t xml:space="preserve">Kiểu đau quy chiếu của cơ thang trên, cơ nâng vai, cơ dưới gai, cơ mông nhỡ.</w:t>
-      </w:r>
-    </w:p>
-    <w:p>
-      <w:pPr>
-        <w:pStyle w:val="ListParagraph"/>
-        <w:numPr>
-          <w:ilvl w:val="0"/>
-          <w:numId w:val="2"/>
-        </w:numPr>
-        <w:spacing w:after="40" w:line="312"/>
-        <w:jc w:val="both"/>
-      </w:pPr>
-      <w:r>
-        <w:rPr>
-          <w:rFonts w:ascii="Times New Roman" w:cs="Times New Roman" w:eastAsia="Times New Roman" w:hAnsi="Times New Roman"/>
-          <w:sz w:val="26"/>
-          <w:szCs w:val="26"/>
-        </w:rPr>
-        <w:t xml:space="preserve">Cơ chế tác dụng của nén thiếu máu cục bộ và của trượt dọc theo thớ cơ.</w:t>
-      </w:r>
-    </w:p>
-    <w:p>
-      <w:pPr>
-        <w:pStyle w:val="ListParagraph"/>
-        <w:numPr>
-          <w:ilvl w:val="0"/>
-          <w:numId w:val="2"/>
-        </w:numPr>
-        <w:spacing w:after="40" w:line="312"/>
-        <w:jc w:val="both"/>
-      </w:pPr>
-      <w:r>
-        <w:rPr>
-          <w:rFonts w:ascii="Times New Roman" w:cs="Times New Roman" w:eastAsia="Times New Roman" w:hAnsi="Times New Roman"/>
-          <w:sz w:val="26"/>
-          <w:szCs w:val="26"/>
-        </w:rPr>
-        <w:t xml:space="preserve">Chỉ định, chống chỉ định, tai biến và cách đề phòng.</w:t>
-      </w:r>
-    </w:p>
-    <w:p>
-      <w:pPr>
-        <w:pStyle w:val="ListParagraph"/>
-        <w:numPr>
-          <w:ilvl w:val="0"/>
-          <w:numId w:val="2"/>
-        </w:numPr>
-        <w:spacing w:after="40" w:line="312"/>
-        <w:jc w:val="both"/>
-      </w:pPr>
-      <w:r>
-        <w:rPr>
-          <w:rFonts w:ascii="Times New Roman" w:cs="Times New Roman" w:eastAsia="Times New Roman" w:hAnsi="Times New Roman"/>
-          <w:sz w:val="26"/>
-          <w:szCs w:val="26"/>
-        </w:rPr>
-        <w:t xml:space="preserve">Quy trình nén – day điểm kích hoạt và quy trình trượt dọc theo thớ cơ.</w:t>
+        <w:t xml:space="preserve">Sinh viên đọc, nghiên cứu giáo trình Các phương thức điều trị Vật lý trị liệu II trước ở nhà, mục tiêu bài học và quy trình kỹ thuật. Trước khi học, sinh viên cần nắm:</w:t>
+      </w:r>
+    </w:p>
+    <w:p>
+      <w:pPr>
+        <w:pStyle w:val="ListParagraph"/>
+        <w:numPr>
+          <w:ilvl w:val="0"/>
+          <w:numId w:val="2"/>
+        </w:numPr>
+        <w:spacing w:after="40" w:line="312"/>
+        <w:jc w:val="both"/>
+      </w:pPr>
+      <w:r>
+        <w:rPr>
+          <w:rFonts w:ascii="Times New Roman" w:cs="Times New Roman" w:eastAsia="Times New Roman" w:hAnsi="Times New Roman"/>
+          <w:sz w:val="26"/>
+          <w:szCs w:val="26"/>
+        </w:rPr>
+        <w:t xml:space="preserve">Khái niệm, đặc điểm và cách xác định điểm kích hoạt.</w:t>
+      </w:r>
+    </w:p>
+    <w:p>
+      <w:pPr>
+        <w:pStyle w:val="ListParagraph"/>
+        <w:numPr>
+          <w:ilvl w:val="0"/>
+          <w:numId w:val="2"/>
+        </w:numPr>
+        <w:spacing w:after="40" w:line="312"/>
+        <w:jc w:val="both"/>
+      </w:pPr>
+      <w:r>
+        <w:rPr>
+          <w:rFonts w:ascii="Times New Roman" w:cs="Times New Roman" w:eastAsia="Times New Roman" w:hAnsi="Times New Roman"/>
+          <w:sz w:val="26"/>
+          <w:szCs w:val="26"/>
+        </w:rPr>
+        <w:t xml:space="preserve">Cơ chế tác dụng của nén, day điểm kích hoạt và trượt dọc theo thớ cơ.</w:t>
+      </w:r>
+    </w:p>
+    <w:p>
+      <w:pPr>
+        <w:pStyle w:val="ListParagraph"/>
+        <w:numPr>
+          <w:ilvl w:val="0"/>
+          <w:numId w:val="2"/>
+        </w:numPr>
+        <w:spacing w:after="40" w:line="312"/>
+        <w:jc w:val="both"/>
+      </w:pPr>
+      <w:r>
+        <w:rPr>
+          <w:rFonts w:ascii="Times New Roman" w:cs="Times New Roman" w:eastAsia="Times New Roman" w:hAnsi="Times New Roman"/>
+          <w:sz w:val="26"/>
+          <w:szCs w:val="26"/>
+        </w:rPr>
+        <w:t xml:space="preserve">Chỉ định, chống chỉ định và tai biến.</w:t>
+      </w:r>
+    </w:p>
+    <w:p>
+      <w:pPr>
+        <w:pStyle w:val="ListParagraph"/>
+        <w:numPr>
+          <w:ilvl w:val="0"/>
+          <w:numId w:val="2"/>
+        </w:numPr>
+        <w:spacing w:after="40" w:line="312"/>
+        <w:jc w:val="both"/>
+      </w:pPr>
+      <w:r>
+        <w:rPr>
+          <w:rFonts w:ascii="Times New Roman" w:cs="Times New Roman" w:eastAsia="Times New Roman" w:hAnsi="Times New Roman"/>
+          <w:sz w:val="26"/>
+          <w:szCs w:val="26"/>
+        </w:rPr>
+        <w:t xml:space="preserve">Kỹ thuật nén và day điểm kích hoạt.</w:t>
+      </w:r>
+    </w:p>
+    <w:p>
+      <w:pPr>
+        <w:pStyle w:val="ListParagraph"/>
+        <w:numPr>
+          <w:ilvl w:val="0"/>
+          <w:numId w:val="2"/>
+        </w:numPr>
+        <w:spacing w:after="40" w:line="312"/>
+        <w:jc w:val="both"/>
+      </w:pPr>
+      <w:r>
+        <w:rPr>
+          <w:rFonts w:ascii="Times New Roman" w:cs="Times New Roman" w:eastAsia="Times New Roman" w:hAnsi="Times New Roman"/>
+          <w:sz w:val="26"/>
+          <w:szCs w:val="26"/>
+        </w:rPr>
+        <w:t xml:space="preserve">Kỹ thuật trượt dọc theo thớ cơ ở các nhóm cơ chính.</w:t>
+      </w:r>
+    </w:p>
+    <w:p>
+      <w:pPr>
+        <w:pStyle w:val="ListParagraph"/>
+        <w:numPr>
+          <w:ilvl w:val="0"/>
+          <w:numId w:val="2"/>
+        </w:numPr>
+        <w:spacing w:after="40" w:line="312"/>
+        <w:jc w:val="both"/>
+      </w:pPr>
+      <w:r>
+        <w:rPr>
+          <w:rFonts w:ascii="Times New Roman" w:cs="Times New Roman" w:eastAsia="Times New Roman" w:hAnsi="Times New Roman"/>
+          <w:sz w:val="26"/>
+          <w:szCs w:val="26"/>
+        </w:rPr>
+        <w:t xml:space="preserve">Giải phẫu các nhóm cơ chính liên quan.</w:t>
       </w:r>
     </w:p>
     <w:p>
@@ -3265,7 +3189,7 @@
           <w:sz w:val="26"/>
           <w:szCs w:val="26"/>
         </w:rPr>
-        <w:t xml:space="preserve">Sinh viên tự sờ tìm dải cơ căng ở cơ thang trên của bản thân hoặc bạn học và ghi lại cảm giác, vùng đau quy chiếu (nếu có).</w:t>
+        <w:t xml:space="preserve">Sinh viên vẽ sơ đồ tư duy liên hệ nội dung bài học với các kiến thức giải phẫu, sinh lý đã học và với các phương thức điều trị vật lý khác trong học phần.</w:t>
       </w:r>
     </w:p>
     <w:p>
@@ -3300,45 +3224,26 @@
           <w:sz w:val="26"/>
           <w:szCs w:val="26"/>
         </w:rPr>
-        <w:t xml:space="preserve">Nhân viên văn phòng đau đầu vùng thái dương, đau tăng khi làm việc máy tính lâu.</w:t>
-      </w:r>
-    </w:p>
-    <w:p>
-      <w:pPr>
-        <w:pStyle w:val="ListParagraph"/>
-        <w:numPr>
-          <w:ilvl w:val="0"/>
-          <w:numId w:val="2"/>
-        </w:numPr>
-        <w:spacing w:after="40" w:line="312"/>
-        <w:jc w:val="both"/>
-      </w:pPr>
-      <w:r>
-        <w:rPr>
-          <w:rFonts w:ascii="Times New Roman" w:cs="Times New Roman" w:eastAsia="Times New Roman" w:hAnsi="Times New Roman"/>
-          <w:sz w:val="26"/>
-          <w:szCs w:val="26"/>
-        </w:rPr>
-        <w:t xml:space="preserve">Người chạy bộ đau căng bắp chân khi chạy lên dốc.</w:t>
-      </w:r>
-    </w:p>
-    <w:p>
-      <w:pPr>
-        <w:pStyle w:val="ListParagraph"/>
-        <w:numPr>
-          <w:ilvl w:val="0"/>
-          <w:numId w:val="2"/>
-        </w:numPr>
-        <w:spacing w:after="40" w:line="312"/>
-        <w:jc w:val="both"/>
-      </w:pPr>
-      <w:r>
-        <w:rPr>
-          <w:rFonts w:ascii="Times New Roman" w:cs="Times New Roman" w:eastAsia="Times New Roman" w:hAnsi="Times New Roman"/>
-          <w:sz w:val="26"/>
-          <w:szCs w:val="26"/>
-        </w:rPr>
-        <w:t xml:space="preserve">Người bệnh đang dùng thuốc chống đông có điểm đau ở cơ thang.</w:t>
+        <w:t xml:space="preserve">Lên danh sách các bệnh/tình trạng được chỉ định tác động điểm kích hoạt.</w:t>
+      </w:r>
+    </w:p>
+    <w:p>
+      <w:pPr>
+        <w:pStyle w:val="ListParagraph"/>
+        <w:numPr>
+          <w:ilvl w:val="0"/>
+          <w:numId w:val="2"/>
+        </w:numPr>
+        <w:spacing w:after="40" w:line="312"/>
+        <w:jc w:val="both"/>
+      </w:pPr>
+      <w:r>
+        <w:rPr>
+          <w:rFonts w:ascii="Times New Roman" w:cs="Times New Roman" w:eastAsia="Times New Roman" w:hAnsi="Times New Roman"/>
+          <w:sz w:val="26"/>
+          <w:szCs w:val="26"/>
+        </w:rPr>
+        <w:t xml:space="preserve">Những tai biến nào có thể xảy ra và cách đề phòng?</w:t>
       </w:r>
     </w:p>
     <w:p>
@@ -3400,7 +3305,7 @@
           <w:sz w:val="26"/>
           <w:szCs w:val="26"/>
         </w:rPr>
-        <w:t xml:space="preserve">Điểm kích hoạt (trigger point); Dải cơ căng (taut band); Đau quy chiếu; Đáp ứng co giật tại chỗ (LTR); Điểm kích hoạt hoạt động; Điểm kích hoạt tiềm ẩn; Sờ dẹt; Sờ kẹp; Nén thiếu máu cục bộ; Trượt dọc theo thớ cơ (stripping)</w:t>
+        <w:t xml:space="preserve">Điểm kích hoạt; Đặc điểm điểm kích hoạt; Cách xác định điểm kích hoạt; Nén điểm kích hoạt; Day điểm kích hoạt; Trượt dọc theo thớ cơ; Cơ chế tác dụng; Chỉ định; Chống chỉ định; Tai biến</w:t>
       </w:r>
     </w:p>
     <w:p>
@@ -3436,102 +3341,83 @@
           <w:sz w:val="26"/>
           <w:szCs w:val="26"/>
         </w:rPr>
-        <w:t xml:space="preserve">Trình bày các đặc điểm giúp xác định một điểm kích hoạt.</w:t>
-      </w:r>
-    </w:p>
-    <w:p>
-      <w:pPr>
-        <w:pStyle w:val="ListParagraph"/>
-        <w:numPr>
-          <w:ilvl w:val="0"/>
-          <w:numId w:val="2"/>
-        </w:numPr>
-        <w:spacing w:after="40" w:line="312"/>
-        <w:jc w:val="both"/>
-      </w:pPr>
-      <w:r>
-        <w:rPr>
-          <w:rFonts w:ascii="Times New Roman" w:cs="Times New Roman" w:eastAsia="Times New Roman" w:hAnsi="Times New Roman"/>
-          <w:sz w:val="26"/>
-          <w:szCs w:val="26"/>
-        </w:rPr>
-        <w:t xml:space="preserve">Phân tích cơ chế tác dụng của kỹ thuật nén thiếu máu cục bộ.</w:t>
-      </w:r>
-    </w:p>
-    <w:p>
-      <w:pPr>
-        <w:pStyle w:val="ListParagraph"/>
-        <w:numPr>
-          <w:ilvl w:val="0"/>
-          <w:numId w:val="2"/>
-        </w:numPr>
-        <w:spacing w:after="40" w:line="312"/>
-        <w:jc w:val="both"/>
-      </w:pPr>
-      <w:r>
-        <w:rPr>
-          <w:rFonts w:ascii="Times New Roman" w:cs="Times New Roman" w:eastAsia="Times New Roman" w:hAnsi="Times New Roman"/>
-          <w:sz w:val="26"/>
-          <w:szCs w:val="26"/>
-        </w:rPr>
-        <w:t xml:space="preserve">Mô tả quy trình nén và day điểm kích hoạt (tư thế, lực, thời gian, tiêu chí kết thúc).</w:t>
-      </w:r>
-    </w:p>
-    <w:p>
-      <w:pPr>
-        <w:pStyle w:val="ListParagraph"/>
-        <w:numPr>
-          <w:ilvl w:val="0"/>
-          <w:numId w:val="2"/>
-        </w:numPr>
-        <w:spacing w:after="40" w:line="312"/>
-        <w:jc w:val="both"/>
-      </w:pPr>
-      <w:r>
-        <w:rPr>
-          <w:rFonts w:ascii="Times New Roman" w:cs="Times New Roman" w:eastAsia="Times New Roman" w:hAnsi="Times New Roman"/>
-          <w:sz w:val="26"/>
-          <w:szCs w:val="26"/>
-        </w:rPr>
-        <w:t xml:space="preserve">So sánh trượt dọc theo thớ cơ với thao tác vuốt về lực, tốc độ và mục tiêu.</w:t>
-      </w:r>
-    </w:p>
-    <w:p>
-      <w:pPr>
-        <w:pStyle w:val="ListParagraph"/>
-        <w:numPr>
-          <w:ilvl w:val="0"/>
-          <w:numId w:val="2"/>
-        </w:numPr>
-        <w:spacing w:after="40" w:line="312"/>
-        <w:jc w:val="both"/>
-      </w:pPr>
-      <w:r>
-        <w:rPr>
-          <w:rFonts w:ascii="Times New Roman" w:cs="Times New Roman" w:eastAsia="Times New Roman" w:hAnsi="Times New Roman"/>
-          <w:sz w:val="26"/>
-          <w:szCs w:val="26"/>
-        </w:rPr>
-        <w:t xml:space="preserve">Kể các chống chỉ định và tai biến của kỹ thuật tác động điểm kích hoạt.</w:t>
-      </w:r>
-    </w:p>
-    <w:p>
-      <w:pPr>
-        <w:pStyle w:val="ListParagraph"/>
-        <w:numPr>
-          <w:ilvl w:val="0"/>
-          <w:numId w:val="2"/>
-        </w:numPr>
-        <w:spacing w:after="40" w:line="312"/>
-        <w:jc w:val="both"/>
-      </w:pPr>
-      <w:r>
-        <w:rPr>
-          <w:rFonts w:ascii="Times New Roman" w:cs="Times New Roman" w:eastAsia="Times New Roman" w:hAnsi="Times New Roman"/>
-          <w:sz w:val="26"/>
-          <w:szCs w:val="26"/>
-        </w:rPr>
-        <w:t xml:space="preserve">Vì sao nên kéo dãn cơ sau khi xử lý điểm kích hoạt?</w:t>
+        <w:t xml:space="preserve">Trình bày khái niệm và đặc điểm của điểm kích hoạt.</w:t>
+      </w:r>
+    </w:p>
+    <w:p>
+      <w:pPr>
+        <w:pStyle w:val="ListParagraph"/>
+        <w:numPr>
+          <w:ilvl w:val="0"/>
+          <w:numId w:val="2"/>
+        </w:numPr>
+        <w:spacing w:after="40" w:line="312"/>
+        <w:jc w:val="both"/>
+      </w:pPr>
+      <w:r>
+        <w:rPr>
+          <w:rFonts w:ascii="Times New Roman" w:cs="Times New Roman" w:eastAsia="Times New Roman" w:hAnsi="Times New Roman"/>
+          <w:sz w:val="26"/>
+          <w:szCs w:val="26"/>
+        </w:rPr>
+        <w:t xml:space="preserve">Trình bày cách xác định điểm kích hoạt.</w:t>
+      </w:r>
+    </w:p>
+    <w:p>
+      <w:pPr>
+        <w:pStyle w:val="ListParagraph"/>
+        <w:numPr>
+          <w:ilvl w:val="0"/>
+          <w:numId w:val="2"/>
+        </w:numPr>
+        <w:spacing w:after="40" w:line="312"/>
+        <w:jc w:val="both"/>
+      </w:pPr>
+      <w:r>
+        <w:rPr>
+          <w:rFonts w:ascii="Times New Roman" w:cs="Times New Roman" w:eastAsia="Times New Roman" w:hAnsi="Times New Roman"/>
+          <w:sz w:val="26"/>
+          <w:szCs w:val="26"/>
+        </w:rPr>
+        <w:t xml:space="preserve">Trình bày cơ chế tác dụng, chỉ định, chống chỉ định và tai biến của nén, day điểm kích hoạt và trượt dọc theo thớ cơ.</w:t>
+      </w:r>
+    </w:p>
+    <w:p>
+      <w:pPr>
+        <w:pStyle w:val="ListParagraph"/>
+        <w:numPr>
+          <w:ilvl w:val="0"/>
+          <w:numId w:val="2"/>
+        </w:numPr>
+        <w:spacing w:after="40" w:line="312"/>
+        <w:jc w:val="both"/>
+      </w:pPr>
+      <w:r>
+        <w:rPr>
+          <w:rFonts w:ascii="Times New Roman" w:cs="Times New Roman" w:eastAsia="Times New Roman" w:hAnsi="Times New Roman"/>
+          <w:sz w:val="26"/>
+          <w:szCs w:val="26"/>
+        </w:rPr>
+        <w:t xml:space="preserve">Trình bày kỹ thuật nén và day điểm kích hoạt.</w:t>
+      </w:r>
+    </w:p>
+    <w:p>
+      <w:pPr>
+        <w:pStyle w:val="ListParagraph"/>
+        <w:numPr>
+          <w:ilvl w:val="0"/>
+          <w:numId w:val="2"/>
+        </w:numPr>
+        <w:spacing w:after="40" w:line="312"/>
+        <w:jc w:val="both"/>
+      </w:pPr>
+      <w:r>
+        <w:rPr>
+          <w:rFonts w:ascii="Times New Roman" w:cs="Times New Roman" w:eastAsia="Times New Roman" w:hAnsi="Times New Roman"/>
+          <w:sz w:val="26"/>
+          <w:szCs w:val="26"/>
+        </w:rPr>
+        <w:t xml:space="preserve">Trình bày kỹ thuật trượt dọc theo thớ cơ ở các nhóm cơ chính.</w:t>
       </w:r>
     </w:p>
     <w:p>
@@ -3563,7 +3449,7 @@
           <w:sz w:val="26"/>
           <w:szCs w:val="26"/>
         </w:rPr>
-        <w:t xml:space="preserve">Tình huống giả định 1:</w:t>
+        <w:t xml:space="preserve">Tình huống giả định:</w:t>
       </w:r>
     </w:p>
     <w:p>
@@ -3578,7 +3464,7 @@
           <w:sz w:val="26"/>
           <w:szCs w:val="26"/>
         </w:rPr>
-        <w:t xml:space="preserve">Nữ 28 tuổi, nhân viên kế toán, đau cổ vai phải và đau đầu vùng thái dương phải 2 tháng, tăng khi làm việc máy tính lâu. Khám: dải cơ căng ở bờ trên cơ thang phải, ấn vào nốt đau tái hiện cơn đau thái dương; nghiêng cổ trái giảm nhẹ; không có dấu hiệu thần kinh khu trú.</w:t>
+        <w:t xml:space="preserve">Một bệnh nhân giả định có điểm kích hoạt ở một nhóm cơ chính được chỉ định tác động điểm kích hoạt tại phòng thực hành.</w:t>
       </w:r>
     </w:p>
     <w:p>
@@ -3612,60 +3498,79 @@
           <w:sz w:val="26"/>
           <w:szCs w:val="26"/>
         </w:rPr>
-        <w:t xml:space="preserve">Xác định cơ có điểm kích hoạt và giải thích mối liên quan với đau đầu.</w:t>
-      </w:r>
-    </w:p>
-    <w:p>
-      <w:pPr>
-        <w:pStyle w:val="ListParagraph"/>
-        <w:numPr>
-          <w:ilvl w:val="0"/>
-          <w:numId w:val="2"/>
-        </w:numPr>
-        <w:spacing w:after="40" w:line="312"/>
-        <w:jc w:val="both"/>
-      </w:pPr>
-      <w:r>
-        <w:rPr>
-          <w:rFonts w:ascii="Times New Roman" w:cs="Times New Roman" w:eastAsia="Times New Roman" w:hAnsi="Times New Roman"/>
-          <w:sz w:val="26"/>
-          <w:szCs w:val="26"/>
-        </w:rPr>
-        <w:t xml:space="preserve">Mô tả cách thực hiện nén và day điểm kích hoạt (tư thế, vị trí tay, lực, thời gian).</w:t>
-      </w:r>
-    </w:p>
-    <w:p>
-      <w:pPr>
-        <w:pStyle w:val="ListParagraph"/>
-        <w:numPr>
-          <w:ilvl w:val="0"/>
-          <w:numId w:val="2"/>
-        </w:numPr>
-        <w:spacing w:after="40" w:line="312"/>
-        <w:jc w:val="both"/>
-      </w:pPr>
-      <w:r>
-        <w:rPr>
-          <w:rFonts w:ascii="Times New Roman" w:cs="Times New Roman" w:eastAsia="Times New Roman" w:hAnsi="Times New Roman"/>
-          <w:sz w:val="26"/>
-          <w:szCs w:val="26"/>
-        </w:rPr>
-        <w:t xml:space="preserve">Đề xuất hoạt động phối hợp sau kỹ thuật (kéo dãn, hướng dẫn tư thế làm việc).</w:t>
-      </w:r>
-    </w:p>
-    <w:p>
-      <w:pPr>
-        <w:keepNext/>
-        <w:spacing w:after="60" w:before="0" w:line="312"/>
-        <w:jc w:val="both"/>
-      </w:pPr>
-      <w:r>
-        <w:rPr>
-          <w:rFonts w:ascii="Times New Roman" w:cs="Times New Roman" w:eastAsia="Times New Roman" w:hAnsi="Times New Roman"/>
-          <w:sz w:val="26"/>
-          <w:szCs w:val="26"/>
-        </w:rPr>
-        <w:t xml:space="preserve">Tình huống giả định 2:</w:t>
+        <w:t xml:space="preserve">Trình bày cách xác định điểm kích hoạt.</w:t>
+      </w:r>
+    </w:p>
+    <w:p>
+      <w:pPr>
+        <w:pStyle w:val="ListParagraph"/>
+        <w:numPr>
+          <w:ilvl w:val="0"/>
+          <w:numId w:val="2"/>
+        </w:numPr>
+        <w:spacing w:after="40" w:line="312"/>
+        <w:jc w:val="both"/>
+      </w:pPr>
+      <w:r>
+        <w:rPr>
+          <w:rFonts w:ascii="Times New Roman" w:cs="Times New Roman" w:eastAsia="Times New Roman" w:hAnsi="Times New Roman"/>
+          <w:sz w:val="26"/>
+          <w:szCs w:val="26"/>
+        </w:rPr>
+        <w:t xml:space="preserve">Lựa chọn kỹ thuật phù hợp (nén, day hoặc trượt dọc theo thớ cơ) và giải thích.</w:t>
+      </w:r>
+    </w:p>
+    <w:p>
+      <w:pPr>
+        <w:pStyle w:val="ListParagraph"/>
+        <w:numPr>
+          <w:ilvl w:val="0"/>
+          <w:numId w:val="2"/>
+        </w:numPr>
+        <w:spacing w:after="40" w:line="312"/>
+        <w:jc w:val="both"/>
+      </w:pPr>
+      <w:r>
+        <w:rPr>
+          <w:rFonts w:ascii="Times New Roman" w:cs="Times New Roman" w:eastAsia="Times New Roman" w:hAnsi="Times New Roman"/>
+          <w:sz w:val="26"/>
+          <w:szCs w:val="26"/>
+        </w:rPr>
+        <w:t xml:space="preserve">Trình bày các bước thực hiện kỹ thuật: chào hỏi, giao tiếp, kiểm tra thông tin người bệnh; hướng dẫn, giải thích kỹ thuật; đặt tư thế người bệnh và tư thế kỹ thuật viên; bộc lộ vùng điều trị; thực hiện kỹ thuật; theo dõi và xử trí khi người bệnh phản hồi cảm giác; kết thúc điều trị.</w:t>
+      </w:r>
+    </w:p>
+    <w:p>
+      <w:pPr>
+        <w:keepNext/>
+        <w:spacing w:after="80" w:before="280" w:line="312"/>
+        <w:jc w:val="left"/>
+      </w:pPr>
+      <w:r>
+        <w:rPr>
+          <w:rFonts w:ascii="Times New Roman" w:cs="Times New Roman" w:eastAsia="Times New Roman" w:hAnsi="Times New Roman"/>
+          <w:b/>
+          <w:bCs/>
+          <w:sz w:val="26"/>
+          <w:szCs w:val="26"/>
+        </w:rPr>
+        <w:t xml:space="preserve">Bài 7. KÉO DÃN</w:t>
+      </w:r>
+    </w:p>
+    <w:p>
+      <w:pPr>
+        <w:keepNext/>
+        <w:spacing w:after="60" w:before="80" w:line="312"/>
+        <w:jc w:val="left"/>
+      </w:pPr>
+      <w:r>
+        <w:rPr>
+          <w:rFonts w:ascii="Times New Roman" w:cs="Times New Roman" w:eastAsia="Times New Roman" w:hAnsi="Times New Roman"/>
+          <w:b/>
+          <w:bCs/>
+          <w:sz w:val="26"/>
+          <w:szCs w:val="26"/>
+        </w:rPr>
+        <w:t xml:space="preserve">1. Tóm tắt</w:t>
       </w:r>
     </w:p>
     <w:p>
@@ -3680,85 +3585,13 @@
           <w:sz w:val="26"/>
           <w:szCs w:val="26"/>
         </w:rPr>
-        <w:t xml:space="preserve">Nam 35 tuổi, chạy bộ 30 km/tuần, đau căng bắp chân trái 3 tuần, đau tăng khi chạy lên dốc. Khám: dải cơ căng ở đầu trong cơ bụng chân trái, không sưng nóng, không giãn tĩnh mạch.</w:t>
-      </w:r>
-    </w:p>
-    <w:p>
-      <w:pPr>
-        <w:keepNext/>
-        <w:spacing w:after="60" w:before="0" w:line="312"/>
-        <w:jc w:val="both"/>
-      </w:pPr>
-      <w:r>
-        <w:rPr>
-          <w:rFonts w:ascii="Times New Roman" w:cs="Times New Roman" w:eastAsia="Times New Roman" w:hAnsi="Times New Roman"/>
-          <w:sz w:val="26"/>
-          <w:szCs w:val="26"/>
-        </w:rPr>
-        <w:t xml:space="preserve">Yêu cầu đối với sinh viên:</w:t>
-      </w:r>
-    </w:p>
-    <w:p>
-      <w:pPr>
-        <w:pStyle w:val="ListParagraph"/>
-        <w:numPr>
-          <w:ilvl w:val="0"/>
-          <w:numId w:val="2"/>
-        </w:numPr>
-        <w:spacing w:after="40" w:line="312"/>
-        <w:jc w:val="both"/>
-      </w:pPr>
-      <w:r>
-        <w:rPr>
-          <w:rFonts w:ascii="Times New Roman" w:cs="Times New Roman" w:eastAsia="Times New Roman" w:hAnsi="Times New Roman"/>
-          <w:sz w:val="26"/>
-          <w:szCs w:val="26"/>
-        </w:rPr>
-        <w:t xml:space="preserve">Phân tích cơ sở lựa chọn kỹ thuật trượt dọc theo thớ cơ.</w:t>
-      </w:r>
-    </w:p>
-    <w:p>
-      <w:pPr>
-        <w:pStyle w:val="ListParagraph"/>
-        <w:numPr>
-          <w:ilvl w:val="0"/>
-          <w:numId w:val="2"/>
-        </w:numPr>
-        <w:spacing w:after="40" w:line="312"/>
-        <w:jc w:val="both"/>
-      </w:pPr>
-      <w:r>
-        <w:rPr>
-          <w:rFonts w:ascii="Times New Roman" w:cs="Times New Roman" w:eastAsia="Times New Roman" w:hAnsi="Times New Roman"/>
-          <w:sz w:val="26"/>
-          <w:szCs w:val="26"/>
-        </w:rPr>
-        <w:t xml:space="preserve">Mô tả tư thế người bệnh, hướng trượt, phần tay sử dụng và lực.</w:t>
-      </w:r>
-    </w:p>
-    <w:p>
-      <w:pPr>
-        <w:pStyle w:val="ListParagraph"/>
-        <w:numPr>
-          <w:ilvl w:val="0"/>
-          <w:numId w:val="2"/>
-        </w:numPr>
-        <w:spacing w:after="40" w:line="312"/>
-        <w:jc w:val="both"/>
-      </w:pPr>
-      <w:r>
-        <w:rPr>
-          <w:rFonts w:ascii="Times New Roman" w:cs="Times New Roman" w:eastAsia="Times New Roman" w:hAnsi="Times New Roman"/>
-          <w:sz w:val="26"/>
-          <w:szCs w:val="26"/>
-        </w:rPr>
-        <w:t xml:space="preserve">Nêu các chống chỉ định cần loại trừ trước khi thực hiện.</w:t>
-      </w:r>
-    </w:p>
-    <w:p>
-      <w:pPr>
-        <w:keepNext/>
-        <w:spacing w:after="80" w:before="280" w:line="312"/>
+        <w:t xml:space="preserve">Bài học trình bày cơ chế tác dụng của kéo dãn (cơ học, thần kinh), phân loại và thông số kéo dãn; chỉ định và chống chỉ định; kỹ thuật kéo dãn các nhóm cơ chính và nguyên tắc an toàn. Bài học giúp sinh viên lựa chọn kỹ thuật kéo dãn phù hợp với đáp ứng của người bệnh, làm cơ sở để thực hiện đúng kỹ thuật, bảo đảm an toàn trên người bệnh giả định.</w:t>
+      </w:r>
+    </w:p>
+    <w:p>
+      <w:pPr>
+        <w:keepNext/>
+        <w:spacing w:after="60" w:before="80" w:line="312"/>
         <w:jc w:val="left"/>
       </w:pPr>
       <w:r>
@@ -3769,7 +3602,220 @@
           <w:sz w:val="26"/>
           <w:szCs w:val="26"/>
         </w:rPr>
-        <w:t xml:space="preserve">Bài 7. KÉO DÃN</w:t>
+        <w:t xml:space="preserve">2. Các bước cần chuẩn bị</w:t>
+      </w:r>
+    </w:p>
+    <w:p>
+      <w:pPr>
+        <w:spacing w:after="60" w:before="0" w:line="312"/>
+        <w:ind w:firstLine="567"/>
+        <w:jc w:val="both"/>
+      </w:pPr>
+      <w:r>
+        <w:rPr>
+          <w:rFonts w:ascii="Times New Roman" w:cs="Times New Roman" w:eastAsia="Times New Roman" w:hAnsi="Times New Roman"/>
+          <w:sz w:val="26"/>
+          <w:szCs w:val="26"/>
+        </w:rPr>
+        <w:t xml:space="preserve">Sinh viên đọc, nghiên cứu giáo trình Các phương thức điều trị Vật lý trị liệu II trước ở nhà, mục tiêu bài học và quy trình kỹ thuật. Trước khi học, sinh viên cần nắm:</w:t>
+      </w:r>
+    </w:p>
+    <w:p>
+      <w:pPr>
+        <w:pStyle w:val="ListParagraph"/>
+        <w:numPr>
+          <w:ilvl w:val="0"/>
+          <w:numId w:val="2"/>
+        </w:numPr>
+        <w:spacing w:after="40" w:line="312"/>
+        <w:jc w:val="both"/>
+      </w:pPr>
+      <w:r>
+        <w:rPr>
+          <w:rFonts w:ascii="Times New Roman" w:cs="Times New Roman" w:eastAsia="Times New Roman" w:hAnsi="Times New Roman"/>
+          <w:sz w:val="26"/>
+          <w:szCs w:val="26"/>
+        </w:rPr>
+        <w:t xml:space="preserve">Cơ chế tác dụng của kéo dãn (cơ học, thần kinh).</w:t>
+      </w:r>
+    </w:p>
+    <w:p>
+      <w:pPr>
+        <w:pStyle w:val="ListParagraph"/>
+        <w:numPr>
+          <w:ilvl w:val="0"/>
+          <w:numId w:val="2"/>
+        </w:numPr>
+        <w:spacing w:after="40" w:line="312"/>
+        <w:jc w:val="both"/>
+      </w:pPr>
+      <w:r>
+        <w:rPr>
+          <w:rFonts w:ascii="Times New Roman" w:cs="Times New Roman" w:eastAsia="Times New Roman" w:hAnsi="Times New Roman"/>
+          <w:sz w:val="26"/>
+          <w:szCs w:val="26"/>
+        </w:rPr>
+        <w:t xml:space="preserve">Phân loại và thông số kéo dãn.</w:t>
+      </w:r>
+    </w:p>
+    <w:p>
+      <w:pPr>
+        <w:pStyle w:val="ListParagraph"/>
+        <w:numPr>
+          <w:ilvl w:val="0"/>
+          <w:numId w:val="2"/>
+        </w:numPr>
+        <w:spacing w:after="40" w:line="312"/>
+        <w:jc w:val="both"/>
+      </w:pPr>
+      <w:r>
+        <w:rPr>
+          <w:rFonts w:ascii="Times New Roman" w:cs="Times New Roman" w:eastAsia="Times New Roman" w:hAnsi="Times New Roman"/>
+          <w:sz w:val="26"/>
+          <w:szCs w:val="26"/>
+        </w:rPr>
+        <w:t xml:space="preserve">Chỉ định và chống chỉ định.</w:t>
+      </w:r>
+    </w:p>
+    <w:p>
+      <w:pPr>
+        <w:pStyle w:val="ListParagraph"/>
+        <w:numPr>
+          <w:ilvl w:val="0"/>
+          <w:numId w:val="2"/>
+        </w:numPr>
+        <w:spacing w:after="40" w:line="312"/>
+        <w:jc w:val="both"/>
+      </w:pPr>
+      <w:r>
+        <w:rPr>
+          <w:rFonts w:ascii="Times New Roman" w:cs="Times New Roman" w:eastAsia="Times New Roman" w:hAnsi="Times New Roman"/>
+          <w:sz w:val="26"/>
+          <w:szCs w:val="26"/>
+        </w:rPr>
+        <w:t xml:space="preserve">Kỹ thuật kéo dãn các nhóm cơ chính.</w:t>
+      </w:r>
+    </w:p>
+    <w:p>
+      <w:pPr>
+        <w:pStyle w:val="ListParagraph"/>
+        <w:numPr>
+          <w:ilvl w:val="0"/>
+          <w:numId w:val="2"/>
+        </w:numPr>
+        <w:spacing w:after="40" w:line="312"/>
+        <w:jc w:val="both"/>
+      </w:pPr>
+      <w:r>
+        <w:rPr>
+          <w:rFonts w:ascii="Times New Roman" w:cs="Times New Roman" w:eastAsia="Times New Roman" w:hAnsi="Times New Roman"/>
+          <w:sz w:val="26"/>
+          <w:szCs w:val="26"/>
+        </w:rPr>
+        <w:t xml:space="preserve">Nguyên tắc an toàn khi kéo dãn.</w:t>
+      </w:r>
+    </w:p>
+    <w:p>
+      <w:pPr>
+        <w:pStyle w:val="ListParagraph"/>
+        <w:numPr>
+          <w:ilvl w:val="0"/>
+          <w:numId w:val="2"/>
+        </w:numPr>
+        <w:spacing w:after="40" w:line="312"/>
+        <w:jc w:val="both"/>
+      </w:pPr>
+      <w:r>
+        <w:rPr>
+          <w:rFonts w:ascii="Times New Roman" w:cs="Times New Roman" w:eastAsia="Times New Roman" w:hAnsi="Times New Roman"/>
+          <w:sz w:val="26"/>
+          <w:szCs w:val="26"/>
+        </w:rPr>
+        <w:t xml:space="preserve">Giải phẫu các nhóm cơ chính liên quan.</w:t>
+      </w:r>
+    </w:p>
+    <w:p>
+      <w:pPr>
+        <w:keepNext/>
+        <w:spacing w:after="60" w:before="0" w:line="312"/>
+        <w:jc w:val="both"/>
+      </w:pPr>
+      <w:r>
+        <w:rPr>
+          <w:rFonts w:ascii="Times New Roman" w:cs="Times New Roman" w:eastAsia="Times New Roman" w:hAnsi="Times New Roman"/>
+          <w:sz w:val="26"/>
+          <w:szCs w:val="26"/>
+        </w:rPr>
+        <w:t xml:space="preserve">Liên hệ thực tiễn:</w:t>
+      </w:r>
+    </w:p>
+    <w:p>
+      <w:pPr>
+        <w:spacing w:after="60" w:before="0" w:line="312"/>
+        <w:ind w:firstLine="567"/>
+        <w:jc w:val="both"/>
+      </w:pPr>
+      <w:r>
+        <w:rPr>
+          <w:rFonts w:ascii="Times New Roman" w:cs="Times New Roman" w:eastAsia="Times New Roman" w:hAnsi="Times New Roman"/>
+          <w:sz w:val="26"/>
+          <w:szCs w:val="26"/>
+        </w:rPr>
+        <w:t xml:space="preserve">Sinh viên vẽ sơ đồ tư duy liên hệ nội dung bài học với các kiến thức giải phẫu, sinh lý đã học và với các phương thức điều trị vật lý khác trong học phần.</w:t>
+      </w:r>
+    </w:p>
+    <w:p>
+      <w:pPr>
+        <w:keepNext/>
+        <w:spacing w:after="60" w:before="0" w:line="312"/>
+        <w:ind w:firstLine="567"/>
+        <w:jc w:val="both"/>
+      </w:pPr>
+      <w:r>
+        <w:rPr>
+          <w:rFonts w:ascii="Times New Roman" w:cs="Times New Roman" w:eastAsia="Times New Roman" w:hAnsi="Times New Roman"/>
+          <w:sz w:val="26"/>
+          <w:szCs w:val="26"/>
+        </w:rPr>
+        <w:t xml:space="preserve">Sinh viên suy nghĩ về các tình huống sau:</w:t>
+      </w:r>
+    </w:p>
+    <w:p>
+      <w:pPr>
+        <w:pStyle w:val="ListParagraph"/>
+        <w:numPr>
+          <w:ilvl w:val="0"/>
+          <w:numId w:val="2"/>
+        </w:numPr>
+        <w:spacing w:after="40" w:line="312"/>
+        <w:jc w:val="both"/>
+      </w:pPr>
+      <w:r>
+        <w:rPr>
+          <w:rFonts w:ascii="Times New Roman" w:cs="Times New Roman" w:eastAsia="Times New Roman" w:hAnsi="Times New Roman"/>
+          <w:sz w:val="26"/>
+          <w:szCs w:val="26"/>
+        </w:rPr>
+        <w:t xml:space="preserve">Lên danh sách các bệnh/tình trạng được chỉ định kéo dãn.</w:t>
+      </w:r>
+    </w:p>
+    <w:p>
+      <w:pPr>
+        <w:pStyle w:val="ListParagraph"/>
+        <w:numPr>
+          <w:ilvl w:val="0"/>
+          <w:numId w:val="2"/>
+        </w:numPr>
+        <w:spacing w:after="40" w:line="312"/>
+        <w:jc w:val="both"/>
+      </w:pPr>
+      <w:r>
+        <w:rPr>
+          <w:rFonts w:ascii="Times New Roman" w:cs="Times New Roman" w:eastAsia="Times New Roman" w:hAnsi="Times New Roman"/>
+          <w:sz w:val="26"/>
+          <w:szCs w:val="26"/>
+        </w:rPr>
+        <w:t xml:space="preserve">Những nguyên tắc nào giúp bảo đảm an toàn khi kéo dãn?</w:t>
       </w:r>
     </w:p>
     <w:p>
@@ -3786,7 +3832,196 @@
           <w:sz w:val="26"/>
           <w:szCs w:val="26"/>
         </w:rPr>
-        <w:t xml:space="preserve">1. Tóm tắt</w:t>
+        <w:t xml:space="preserve">3. Tài liệu cần tham khảo</w:t>
+      </w:r>
+    </w:p>
+    <w:p>
+      <w:pPr>
+        <w:spacing w:after="60" w:before="0" w:line="312"/>
+        <w:jc w:val="both"/>
+      </w:pPr>
+      <w:r>
+        <w:rPr>
+          <w:rFonts w:ascii="Times New Roman" w:cs="Times New Roman" w:eastAsia="Times New Roman" w:hAnsi="Times New Roman"/>
+          <w:sz w:val="26"/>
+          <w:szCs w:val="26"/>
+        </w:rPr>
+        <w:t xml:space="preserve">Lê Quang Khanh (2016), Các phương thức điều trị Vật lý trị liệu II. Trường Đại học Kỹ thuật Y - Dược Đà Nẵng. Lưu hành nội bộ.</w:t>
+      </w:r>
+    </w:p>
+    <w:p>
+      <w:pPr>
+        <w:keepNext/>
+        <w:spacing w:after="60" w:before="80" w:line="312"/>
+        <w:jc w:val="left"/>
+      </w:pPr>
+      <w:r>
+        <w:rPr>
+          <w:rFonts w:ascii="Times New Roman" w:cs="Times New Roman" w:eastAsia="Times New Roman" w:hAnsi="Times New Roman"/>
+          <w:b/>
+          <w:bCs/>
+          <w:sz w:val="26"/>
+          <w:szCs w:val="26"/>
+        </w:rPr>
+        <w:t xml:space="preserve">4. Các thuật ngữ cần nắm</w:t>
+      </w:r>
+    </w:p>
+    <w:p>
+      <w:pPr>
+        <w:spacing w:after="60" w:before="0" w:line="312"/>
+        <w:jc w:val="both"/>
+      </w:pPr>
+      <w:r>
+        <w:rPr>
+          <w:rFonts w:ascii="Times New Roman" w:cs="Times New Roman" w:eastAsia="Times New Roman" w:hAnsi="Times New Roman"/>
+          <w:sz w:val="26"/>
+          <w:szCs w:val="26"/>
+        </w:rPr>
+        <w:t xml:space="preserve">Kéo dãn; Cơ chế tác dụng; Phân loại kéo dãn; Thông số kéo dãn; Chỉ định; Chống chỉ định; Nguyên tắc an toàn</w:t>
+      </w:r>
+    </w:p>
+    <w:p>
+      <w:pPr>
+        <w:keepNext/>
+        <w:spacing w:after="60" w:before="80" w:line="312"/>
+        <w:jc w:val="left"/>
+      </w:pPr>
+      <w:r>
+        <w:rPr>
+          <w:rFonts w:ascii="Times New Roman" w:cs="Times New Roman" w:eastAsia="Times New Roman" w:hAnsi="Times New Roman"/>
+          <w:b/>
+          <w:bCs/>
+          <w:sz w:val="26"/>
+          <w:szCs w:val="26"/>
+        </w:rPr>
+        <w:t xml:space="preserve">5. Các câu hỏi tự lượng giá</w:t>
+      </w:r>
+    </w:p>
+    <w:p>
+      <w:pPr>
+        <w:pStyle w:val="ListParagraph"/>
+        <w:numPr>
+          <w:ilvl w:val="0"/>
+          <w:numId w:val="2"/>
+        </w:numPr>
+        <w:spacing w:after="40" w:line="312"/>
+        <w:jc w:val="both"/>
+      </w:pPr>
+      <w:r>
+        <w:rPr>
+          <w:rFonts w:ascii="Times New Roman" w:cs="Times New Roman" w:eastAsia="Times New Roman" w:hAnsi="Times New Roman"/>
+          <w:sz w:val="26"/>
+          <w:szCs w:val="26"/>
+        </w:rPr>
+        <w:t xml:space="preserve">Trình bày cơ chế tác dụng của kéo dãn.</w:t>
+      </w:r>
+    </w:p>
+    <w:p>
+      <w:pPr>
+        <w:pStyle w:val="ListParagraph"/>
+        <w:numPr>
+          <w:ilvl w:val="0"/>
+          <w:numId w:val="2"/>
+        </w:numPr>
+        <w:spacing w:after="40" w:line="312"/>
+        <w:jc w:val="both"/>
+      </w:pPr>
+      <w:r>
+        <w:rPr>
+          <w:rFonts w:ascii="Times New Roman" w:cs="Times New Roman" w:eastAsia="Times New Roman" w:hAnsi="Times New Roman"/>
+          <w:sz w:val="26"/>
+          <w:szCs w:val="26"/>
+        </w:rPr>
+        <w:t xml:space="preserve">Trình bày phân loại và thông số kéo dãn.</w:t>
+      </w:r>
+    </w:p>
+    <w:p>
+      <w:pPr>
+        <w:pStyle w:val="ListParagraph"/>
+        <w:numPr>
+          <w:ilvl w:val="0"/>
+          <w:numId w:val="2"/>
+        </w:numPr>
+        <w:spacing w:after="40" w:line="312"/>
+        <w:jc w:val="both"/>
+      </w:pPr>
+      <w:r>
+        <w:rPr>
+          <w:rFonts w:ascii="Times New Roman" w:cs="Times New Roman" w:eastAsia="Times New Roman" w:hAnsi="Times New Roman"/>
+          <w:sz w:val="26"/>
+          <w:szCs w:val="26"/>
+        </w:rPr>
+        <w:t xml:space="preserve">Kể các chỉ định và chống chỉ định của kéo dãn.</w:t>
+      </w:r>
+    </w:p>
+    <w:p>
+      <w:pPr>
+        <w:pStyle w:val="ListParagraph"/>
+        <w:numPr>
+          <w:ilvl w:val="0"/>
+          <w:numId w:val="2"/>
+        </w:numPr>
+        <w:spacing w:after="40" w:line="312"/>
+        <w:jc w:val="both"/>
+      </w:pPr>
+      <w:r>
+        <w:rPr>
+          <w:rFonts w:ascii="Times New Roman" w:cs="Times New Roman" w:eastAsia="Times New Roman" w:hAnsi="Times New Roman"/>
+          <w:sz w:val="26"/>
+          <w:szCs w:val="26"/>
+        </w:rPr>
+        <w:t xml:space="preserve">Trình bày kỹ thuật kéo dãn các nhóm cơ chính.</w:t>
+      </w:r>
+    </w:p>
+    <w:p>
+      <w:pPr>
+        <w:pStyle w:val="ListParagraph"/>
+        <w:numPr>
+          <w:ilvl w:val="0"/>
+          <w:numId w:val="2"/>
+        </w:numPr>
+        <w:spacing w:after="40" w:line="312"/>
+        <w:jc w:val="both"/>
+      </w:pPr>
+      <w:r>
+        <w:rPr>
+          <w:rFonts w:ascii="Times New Roman" w:cs="Times New Roman" w:eastAsia="Times New Roman" w:hAnsi="Times New Roman"/>
+          <w:sz w:val="26"/>
+          <w:szCs w:val="26"/>
+        </w:rPr>
+        <w:t xml:space="preserve">Trình bày các nguyên tắc an toàn khi kéo dãn.</w:t>
+      </w:r>
+    </w:p>
+    <w:p>
+      <w:pPr>
+        <w:keepNext/>
+        <w:spacing w:after="60" w:before="80" w:line="312"/>
+        <w:jc w:val="left"/>
+      </w:pPr>
+      <w:r>
+        <w:rPr>
+          <w:rFonts w:ascii="Times New Roman" w:cs="Times New Roman" w:eastAsia="Times New Roman" w:hAnsi="Times New Roman"/>
+          <w:b/>
+          <w:bCs/>
+          <w:sz w:val="26"/>
+          <w:szCs w:val="26"/>
+        </w:rPr>
+        <w:t xml:space="preserve">6. Bài tập/tình huống cần chuẩn bị</w:t>
+      </w:r>
+    </w:p>
+    <w:p>
+      <w:pPr>
+        <w:keepNext/>
+        <w:spacing w:after="60" w:before="0" w:line="312"/>
+        <w:jc w:val="both"/>
+      </w:pPr>
+      <w:r>
+        <w:rPr>
+          <w:rFonts w:ascii="Times New Roman" w:cs="Times New Roman" w:eastAsia="Times New Roman" w:hAnsi="Times New Roman"/>
+          <w:sz w:val="26"/>
+          <w:szCs w:val="26"/>
+        </w:rPr>
+        <w:t xml:space="preserve">Tình huống giả định:</w:t>
       </w:r>
     </w:p>
     <w:p>
@@ -3801,478 +4036,13 @@
           <w:sz w:val="26"/>
           <w:szCs w:val="26"/>
         </w:rPr>
-        <w:t xml:space="preserve">Bài học trình bày kỹ thuật kéo dãn mô mềm nhằm gia tăng chiều dài cơ – gân và tầm vận động khớp. Sinh viên tìm hiểu cơ chế tác dụng dựa trên tính chất đàn hồi – nhớt của mô (biến dạng từ từ, giãn ứng suất), các cơ chế thần kinh (phản xạ căng, ức chế tự sinh, ức chế đối vận) và sự tăng dung nạp kéo dãn; các loại kéo dãn (tĩnh, động, thụ động, chủ động, tự kéo dãn, kéo dãn theo nguyên lý PNF), thông số, chỉ định, chống chỉ định và nguyên tắc an toàn khi kéo dãn các nhóm cơ chính. Bài học là cầu nối giữa phần tác động mô mềm và phần PNF.</w:t>
-      </w:r>
-    </w:p>
-    <w:p>
-      <w:pPr>
-        <w:keepNext/>
-        <w:spacing w:after="60" w:before="80" w:line="312"/>
-        <w:jc w:val="left"/>
-      </w:pPr>
-      <w:r>
-        <w:rPr>
-          <w:rFonts w:ascii="Times New Roman" w:cs="Times New Roman" w:eastAsia="Times New Roman" w:hAnsi="Times New Roman"/>
-          <w:b/>
-          <w:bCs/>
-          <w:sz w:val="26"/>
-          <w:szCs w:val="26"/>
-        </w:rPr>
-        <w:t xml:space="preserve">2. Các bước cần chuẩn bị</w:t>
-      </w:r>
-    </w:p>
-    <w:p>
-      <w:pPr>
+        <w:t xml:space="preserve">Một bệnh nhân giả định có hạn chế tầm vận động do ngắn một nhóm cơ chính được chỉ định kéo dãn tại phòng thực hành.</w:t>
+      </w:r>
+    </w:p>
+    <w:p>
+      <w:pPr>
+        <w:keepNext/>
         <w:spacing w:after="60" w:before="0" w:line="312"/>
-        <w:ind w:firstLine="567"/>
-        <w:jc w:val="both"/>
-      </w:pPr>
-      <w:r>
-        <w:rPr>
-          <w:rFonts w:ascii="Times New Roman" w:cs="Times New Roman" w:eastAsia="Times New Roman" w:hAnsi="Times New Roman"/>
-          <w:sz w:val="26"/>
-          <w:szCs w:val="26"/>
-        </w:rPr>
-        <w:t xml:space="preserve">Sinh viên đọc kỹ giáo trình Các phương thức điều trị Vật lý trị liệu II, mục tiêu bài học và các yêu cầu thực hành. Trước khi học, sinh viên cần nắm:</w:t>
-      </w:r>
-    </w:p>
-    <w:p>
-      <w:pPr>
-        <w:pStyle w:val="ListParagraph"/>
-        <w:numPr>
-          <w:ilvl w:val="0"/>
-          <w:numId w:val="2"/>
-        </w:numPr>
-        <w:spacing w:after="40" w:line="312"/>
-        <w:jc w:val="both"/>
-      </w:pPr>
-      <w:r>
-        <w:rPr>
-          <w:rFonts w:ascii="Times New Roman" w:cs="Times New Roman" w:eastAsia="Times New Roman" w:hAnsi="Times New Roman"/>
-          <w:sz w:val="26"/>
-          <w:szCs w:val="26"/>
-        </w:rPr>
-        <w:t xml:space="preserve">Sinh lý thần kinh – cơ: suốt cơ, cơ quan gân Golgi, phản xạ căng.</w:t>
-      </w:r>
-    </w:p>
-    <w:p>
-      <w:pPr>
-        <w:pStyle w:val="ListParagraph"/>
-        <w:numPr>
-          <w:ilvl w:val="0"/>
-          <w:numId w:val="2"/>
-        </w:numPr>
-        <w:spacing w:after="40" w:line="312"/>
-        <w:jc w:val="both"/>
-      </w:pPr>
-      <w:r>
-        <w:rPr>
-          <w:rFonts w:ascii="Times New Roman" w:cs="Times New Roman" w:eastAsia="Times New Roman" w:hAnsi="Times New Roman"/>
-          <w:sz w:val="26"/>
-          <w:szCs w:val="26"/>
-        </w:rPr>
-        <w:t xml:space="preserve">Tính chất đàn hồi – nhớt của mô mềm; khái niệm co rút.</w:t>
-      </w:r>
-    </w:p>
-    <w:p>
-      <w:pPr>
-        <w:pStyle w:val="ListParagraph"/>
-        <w:numPr>
-          <w:ilvl w:val="0"/>
-          <w:numId w:val="2"/>
-        </w:numPr>
-        <w:spacing w:after="40" w:line="312"/>
-        <w:jc w:val="both"/>
-      </w:pPr>
-      <w:r>
-        <w:rPr>
-          <w:rFonts w:ascii="Times New Roman" w:cs="Times New Roman" w:eastAsia="Times New Roman" w:hAnsi="Times New Roman"/>
-          <w:sz w:val="26"/>
-          <w:szCs w:val="26"/>
-        </w:rPr>
-        <w:t xml:space="preserve">Các loại kéo dãn và thông số (cường độ, thời gian giữ, số lần, tần suất).</w:t>
-      </w:r>
-    </w:p>
-    <w:p>
-      <w:pPr>
-        <w:pStyle w:val="ListParagraph"/>
-        <w:numPr>
-          <w:ilvl w:val="0"/>
-          <w:numId w:val="2"/>
-        </w:numPr>
-        <w:spacing w:after="40" w:line="312"/>
-        <w:jc w:val="both"/>
-      </w:pPr>
-      <w:r>
-        <w:rPr>
-          <w:rFonts w:ascii="Times New Roman" w:cs="Times New Roman" w:eastAsia="Times New Roman" w:hAnsi="Times New Roman"/>
-          <w:sz w:val="26"/>
-          <w:szCs w:val="26"/>
-        </w:rPr>
-        <w:t xml:space="preserve">Chỉ định, chống chỉ định; nguyên tắc cố định đầu gần, kéo đầu xa.</w:t>
-      </w:r>
-    </w:p>
-    <w:p>
-      <w:pPr>
-        <w:pStyle w:val="ListParagraph"/>
-        <w:numPr>
-          <w:ilvl w:val="0"/>
-          <w:numId w:val="2"/>
-        </w:numPr>
-        <w:spacing w:after="40" w:line="312"/>
-        <w:jc w:val="both"/>
-      </w:pPr>
-      <w:r>
-        <w:rPr>
-          <w:rFonts w:ascii="Times New Roman" w:cs="Times New Roman" w:eastAsia="Times New Roman" w:hAnsi="Times New Roman"/>
-          <w:sz w:val="26"/>
-          <w:szCs w:val="26"/>
-        </w:rPr>
-        <w:t xml:space="preserve">Tư thế, cố định và hướng kéo dãn của các nhóm cơ: cơ thang trên, cơ ngực lớn, cơ gập háng, cơ tứ đầu, cơ ụ ngồi cẳng chân, cơ tam đầu cẳng chân.</w:t>
-      </w:r>
-    </w:p>
-    <w:p>
-      <w:pPr>
-        <w:keepNext/>
-        <w:spacing w:after="60" w:before="0" w:line="312"/>
-        <w:jc w:val="both"/>
-      </w:pPr>
-      <w:r>
-        <w:rPr>
-          <w:rFonts w:ascii="Times New Roman" w:cs="Times New Roman" w:eastAsia="Times New Roman" w:hAnsi="Times New Roman"/>
-          <w:sz w:val="26"/>
-          <w:szCs w:val="26"/>
-        </w:rPr>
-        <w:t xml:space="preserve">Liên hệ thực tiễn:</w:t>
-      </w:r>
-    </w:p>
-    <w:p>
-      <w:pPr>
-        <w:spacing w:after="60" w:before="0" w:line="312"/>
-        <w:ind w:firstLine="567"/>
-        <w:jc w:val="both"/>
-      </w:pPr>
-      <w:r>
-        <w:rPr>
-          <w:rFonts w:ascii="Times New Roman" w:cs="Times New Roman" w:eastAsia="Times New Roman" w:hAnsi="Times New Roman"/>
-          <w:sz w:val="26"/>
-          <w:szCs w:val="26"/>
-        </w:rPr>
-        <w:t xml:space="preserve">Sinh viên quan sát thói quen khởi động – kéo dãn khi tập luyện thể thao và nhận xét các sai lầm thường gặp.</w:t>
-      </w:r>
-    </w:p>
-    <w:p>
-      <w:pPr>
-        <w:keepNext/>
-        <w:spacing w:after="60" w:before="0" w:line="312"/>
-        <w:ind w:firstLine="567"/>
-        <w:jc w:val="both"/>
-      </w:pPr>
-      <w:r>
-        <w:rPr>
-          <w:rFonts w:ascii="Times New Roman" w:cs="Times New Roman" w:eastAsia="Times New Roman" w:hAnsi="Times New Roman"/>
-          <w:sz w:val="26"/>
-          <w:szCs w:val="26"/>
-        </w:rPr>
-        <w:t xml:space="preserve">Sinh viên suy nghĩ về các tình huống sau:</w:t>
-      </w:r>
-    </w:p>
-    <w:p>
-      <w:pPr>
-        <w:pStyle w:val="ListParagraph"/>
-        <w:numPr>
-          <w:ilvl w:val="0"/>
-          <w:numId w:val="2"/>
-        </w:numPr>
-        <w:spacing w:after="40" w:line="312"/>
-        <w:jc w:val="both"/>
-      </w:pPr>
-      <w:r>
-        <w:rPr>
-          <w:rFonts w:ascii="Times New Roman" w:cs="Times New Roman" w:eastAsia="Times New Roman" w:hAnsi="Times New Roman"/>
-          <w:sz w:val="26"/>
-          <w:szCs w:val="26"/>
-        </w:rPr>
-        <w:t xml:space="preserve">Vận động viên kéo dãn bằng động tác nảy mạnh trước khi thi đấu.</w:t>
-      </w:r>
-    </w:p>
-    <w:p>
-      <w:pPr>
-        <w:pStyle w:val="ListParagraph"/>
-        <w:numPr>
-          <w:ilvl w:val="0"/>
-          <w:numId w:val="2"/>
-        </w:numPr>
-        <w:spacing w:after="40" w:line="312"/>
-        <w:jc w:val="both"/>
-      </w:pPr>
-      <w:r>
-        <w:rPr>
-          <w:rFonts w:ascii="Times New Roman" w:cs="Times New Roman" w:eastAsia="Times New Roman" w:hAnsi="Times New Roman"/>
-          <w:sz w:val="26"/>
-          <w:szCs w:val="26"/>
-        </w:rPr>
-        <w:t xml:space="preserve">Người bệnh hạn chế duỗi gối do co rút sau bất động 6 tuần.</w:t>
-      </w:r>
-    </w:p>
-    <w:p>
-      <w:pPr>
-        <w:pStyle w:val="ListParagraph"/>
-        <w:numPr>
-          <w:ilvl w:val="0"/>
-          <w:numId w:val="2"/>
-        </w:numPr>
-        <w:spacing w:after="40" w:line="312"/>
-        <w:jc w:val="both"/>
-      </w:pPr>
-      <w:r>
-        <w:rPr>
-          <w:rFonts w:ascii="Times New Roman" w:cs="Times New Roman" w:eastAsia="Times New Roman" w:hAnsi="Times New Roman"/>
-          <w:sz w:val="26"/>
-          <w:szCs w:val="26"/>
-        </w:rPr>
-        <w:t xml:space="preserve">Người bệnh tổn thương tủy cổ dùng hiện tượng tenodesis để cầm nắm.</w:t>
-      </w:r>
-    </w:p>
-    <w:p>
-      <w:pPr>
-        <w:keepNext/>
-        <w:spacing w:after="60" w:before="80" w:line="312"/>
-        <w:jc w:val="left"/>
-      </w:pPr>
-      <w:r>
-        <w:rPr>
-          <w:rFonts w:ascii="Times New Roman" w:cs="Times New Roman" w:eastAsia="Times New Roman" w:hAnsi="Times New Roman"/>
-          <w:b/>
-          <w:bCs/>
-          <w:sz w:val="26"/>
-          <w:szCs w:val="26"/>
-        </w:rPr>
-        <w:t xml:space="preserve">3. Tài liệu cần tham khảo</w:t>
-      </w:r>
-    </w:p>
-    <w:p>
-      <w:pPr>
-        <w:spacing w:after="60" w:before="0" w:line="312"/>
-        <w:jc w:val="both"/>
-      </w:pPr>
-      <w:r>
-        <w:rPr>
-          <w:rFonts w:ascii="Times New Roman" w:cs="Times New Roman" w:eastAsia="Times New Roman" w:hAnsi="Times New Roman"/>
-          <w:sz w:val="26"/>
-          <w:szCs w:val="26"/>
-        </w:rPr>
-        <w:t xml:space="preserve">Lê Quang Khanh (2016), Các phương thức điều trị Vật lý trị liệu II. Trường Đại học Kỹ thuật Y - Dược Đà Nẵng. Lưu hành nội bộ.</w:t>
-      </w:r>
-    </w:p>
-    <w:p>
-      <w:pPr>
-        <w:spacing w:after="60" w:before="0" w:line="312"/>
-        <w:jc w:val="both"/>
-      </w:pPr>
-      <w:r>
-        <w:rPr>
-          <w:rFonts w:ascii="Times New Roman" w:cs="Times New Roman" w:eastAsia="Times New Roman" w:hAnsi="Times New Roman"/>
-          <w:sz w:val="26"/>
-          <w:szCs w:val="26"/>
-        </w:rPr>
-        <w:t xml:space="preserve">Kisner C., Colby L.A., Borstad J. (2018), Therapeutic Exercise: Foundations and Techniques, 7th ed. F.A. Davis.</w:t>
-      </w:r>
-    </w:p>
-    <w:p>
-      <w:pPr>
-        <w:keepNext/>
-        <w:spacing w:after="60" w:before="80" w:line="312"/>
-        <w:jc w:val="left"/>
-      </w:pPr>
-      <w:r>
-        <w:rPr>
-          <w:rFonts w:ascii="Times New Roman" w:cs="Times New Roman" w:eastAsia="Times New Roman" w:hAnsi="Times New Roman"/>
-          <w:b/>
-          <w:bCs/>
-          <w:sz w:val="26"/>
-          <w:szCs w:val="26"/>
-        </w:rPr>
-        <w:t xml:space="preserve">4. Các thuật ngữ cần nắm</w:t>
-      </w:r>
-    </w:p>
-    <w:p>
-      <w:pPr>
-        <w:spacing w:after="60" w:before="0" w:line="312"/>
-        <w:jc w:val="both"/>
-      </w:pPr>
-      <w:r>
-        <w:rPr>
-          <w:rFonts w:ascii="Times New Roman" w:cs="Times New Roman" w:eastAsia="Times New Roman" w:hAnsi="Times New Roman"/>
-          <w:sz w:val="26"/>
-          <w:szCs w:val="26"/>
-        </w:rPr>
-        <w:t xml:space="preserve">Kéo dãn tĩnh; Kéo dãn động; Kéo dãn nảy; Tự kéo dãn; Biến dạng từ từ (creep); Giãn ứng suất (stress relaxation); Phản xạ căng; Ức chế tự sinh; Ức chế đối vận; Co rút</w:t>
-      </w:r>
-    </w:p>
-    <w:p>
-      <w:pPr>
-        <w:keepNext/>
-        <w:spacing w:after="60" w:before="80" w:line="312"/>
-        <w:jc w:val="left"/>
-      </w:pPr>
-      <w:r>
-        <w:rPr>
-          <w:rFonts w:ascii="Times New Roman" w:cs="Times New Roman" w:eastAsia="Times New Roman" w:hAnsi="Times New Roman"/>
-          <w:b/>
-          <w:bCs/>
-          <w:sz w:val="26"/>
-          <w:szCs w:val="26"/>
-        </w:rPr>
-        <w:t xml:space="preserve">5. Các câu hỏi tự lượng giá</w:t>
-      </w:r>
-    </w:p>
-    <w:p>
-      <w:pPr>
-        <w:pStyle w:val="ListParagraph"/>
-        <w:numPr>
-          <w:ilvl w:val="0"/>
-          <w:numId w:val="2"/>
-        </w:numPr>
-        <w:spacing w:after="40" w:line="312"/>
-        <w:jc w:val="both"/>
-      </w:pPr>
-      <w:r>
-        <w:rPr>
-          <w:rFonts w:ascii="Times New Roman" w:cs="Times New Roman" w:eastAsia="Times New Roman" w:hAnsi="Times New Roman"/>
-          <w:sz w:val="26"/>
-          <w:szCs w:val="26"/>
-        </w:rPr>
-        <w:t xml:space="preserve">Phân tích cơ chế cơ học và thần kinh của kéo dãn.</w:t>
-      </w:r>
-    </w:p>
-    <w:p>
-      <w:pPr>
-        <w:pStyle w:val="ListParagraph"/>
-        <w:numPr>
-          <w:ilvl w:val="0"/>
-          <w:numId w:val="2"/>
-        </w:numPr>
-        <w:spacing w:after="40" w:line="312"/>
-        <w:jc w:val="both"/>
-      </w:pPr>
-      <w:r>
-        <w:rPr>
-          <w:rFonts w:ascii="Times New Roman" w:cs="Times New Roman" w:eastAsia="Times New Roman" w:hAnsi="Times New Roman"/>
-          <w:sz w:val="26"/>
-          <w:szCs w:val="26"/>
-        </w:rPr>
-        <w:t xml:space="preserve">So sánh kéo dãn tĩnh, kéo dãn động, kéo dãn nảy và kéo dãn theo nguyên lý PNF.</w:t>
-      </w:r>
-    </w:p>
-    <w:p>
-      <w:pPr>
-        <w:pStyle w:val="ListParagraph"/>
-        <w:numPr>
-          <w:ilvl w:val="0"/>
-          <w:numId w:val="2"/>
-        </w:numPr>
-        <w:spacing w:after="40" w:line="312"/>
-        <w:jc w:val="both"/>
-      </w:pPr>
-      <w:r>
-        <w:rPr>
-          <w:rFonts w:ascii="Times New Roman" w:cs="Times New Roman" w:eastAsia="Times New Roman" w:hAnsi="Times New Roman"/>
-          <w:sz w:val="26"/>
-          <w:szCs w:val="26"/>
-        </w:rPr>
-        <w:t xml:space="preserve">Trình bày các thông số kéo dãn tĩnh thường dùng ở người lớn.</w:t>
-      </w:r>
-    </w:p>
-    <w:p>
-      <w:pPr>
-        <w:pStyle w:val="ListParagraph"/>
-        <w:numPr>
-          <w:ilvl w:val="0"/>
-          <w:numId w:val="2"/>
-        </w:numPr>
-        <w:spacing w:after="40" w:line="312"/>
-        <w:jc w:val="both"/>
-      </w:pPr>
-      <w:r>
-        <w:rPr>
-          <w:rFonts w:ascii="Times New Roman" w:cs="Times New Roman" w:eastAsia="Times New Roman" w:hAnsi="Times New Roman"/>
-          <w:sz w:val="26"/>
-          <w:szCs w:val="26"/>
-        </w:rPr>
-        <w:t xml:space="preserve">Kể các chống chỉ định của kéo dãn.</w:t>
-      </w:r>
-    </w:p>
-    <w:p>
-      <w:pPr>
-        <w:pStyle w:val="ListParagraph"/>
-        <w:numPr>
-          <w:ilvl w:val="0"/>
-          <w:numId w:val="2"/>
-        </w:numPr>
-        <w:spacing w:after="40" w:line="312"/>
-        <w:jc w:val="both"/>
-      </w:pPr>
-      <w:r>
-        <w:rPr>
-          <w:rFonts w:ascii="Times New Roman" w:cs="Times New Roman" w:eastAsia="Times New Roman" w:hAnsi="Times New Roman"/>
-          <w:sz w:val="26"/>
-          <w:szCs w:val="26"/>
-        </w:rPr>
-        <w:t xml:space="preserve">Vì sao không kéo dãn co rút đang giúp ổn định chức năng ở người bệnh tổn thương tủy cổ?</w:t>
-      </w:r>
-    </w:p>
-    <w:p>
-      <w:pPr>
-        <w:keepNext/>
-        <w:spacing w:after="60" w:before="80" w:line="312"/>
-        <w:jc w:val="left"/>
-      </w:pPr>
-      <w:r>
-        <w:rPr>
-          <w:rFonts w:ascii="Times New Roman" w:cs="Times New Roman" w:eastAsia="Times New Roman" w:hAnsi="Times New Roman"/>
-          <w:b/>
-          <w:bCs/>
-          <w:sz w:val="26"/>
-          <w:szCs w:val="26"/>
-        </w:rPr>
-        <w:t xml:space="preserve">6. Bài tập/tình huống cần chuẩn bị</w:t>
-      </w:r>
-    </w:p>
-    <w:p>
-      <w:pPr>
-        <w:keepNext/>
-        <w:spacing w:after="60" w:before="0" w:line="312"/>
-        <w:jc w:val="both"/>
-      </w:pPr>
-      <w:r>
-        <w:rPr>
-          <w:rFonts w:ascii="Times New Roman" w:cs="Times New Roman" w:eastAsia="Times New Roman" w:hAnsi="Times New Roman"/>
-          <w:sz w:val="26"/>
-          <w:szCs w:val="26"/>
-        </w:rPr>
-        <w:t xml:space="preserve">Tình huống giả định:</w:t>
-      </w:r>
-    </w:p>
-    <w:p>
-      <w:pPr>
-        <w:spacing w:after="60" w:before="0" w:line="312"/>
-        <w:ind w:firstLine="567"/>
-        <w:jc w:val="both"/>
-      </w:pPr>
-      <w:r>
-        <w:rPr>
-          <w:rFonts w:ascii="Times New Roman" w:cs="Times New Roman" w:eastAsia="Times New Roman" w:hAnsi="Times New Roman"/>
-          <w:sz w:val="26"/>
-          <w:szCs w:val="26"/>
-        </w:rPr>
-        <w:t xml:space="preserve">Nam 19 tuổi, sinh viên chơi bóng đá, đau mặt sau đùi phải khi chạy nước rút. Kiểm tra nâng chân thẳng thụ động bên phải 60°, bên trái 80°; không đau lưng, không dấu hiệu chèn ép rễ, không có tiền sử rách cơ gần đây.</w:t>
-      </w:r>
-    </w:p>
-    <w:p>
-      <w:pPr>
-        <w:keepNext/>
-        <w:spacing w:after="60" w:before="0" w:line="312"/>
         <w:jc w:val="both"/>
       </w:pPr>
       <w:r>
@@ -4300,45 +4070,45 @@
           <w:sz w:val="26"/>
           <w:szCs w:val="26"/>
         </w:rPr>
-        <w:t xml:space="preserve">Xác định nhóm cơ cần kéo dãn và giải thích.</w:t>
-      </w:r>
-    </w:p>
-    <w:p>
-      <w:pPr>
-        <w:pStyle w:val="ListParagraph"/>
-        <w:numPr>
-          <w:ilvl w:val="0"/>
-          <w:numId w:val="2"/>
-        </w:numPr>
-        <w:spacing w:after="40" w:line="312"/>
-        <w:jc w:val="both"/>
-      </w:pPr>
-      <w:r>
-        <w:rPr>
-          <w:rFonts w:ascii="Times New Roman" w:cs="Times New Roman" w:eastAsia="Times New Roman" w:hAnsi="Times New Roman"/>
-          <w:sz w:val="26"/>
-          <w:szCs w:val="26"/>
-        </w:rPr>
-        <w:t xml:space="preserve">Đề xuất loại kéo dãn, tư thế, cố định và thông số.</w:t>
-      </w:r>
-    </w:p>
-    <w:p>
-      <w:pPr>
-        <w:pStyle w:val="ListParagraph"/>
-        <w:numPr>
-          <w:ilvl w:val="0"/>
-          <w:numId w:val="2"/>
-        </w:numPr>
-        <w:spacing w:after="40" w:line="312"/>
-        <w:jc w:val="both"/>
-      </w:pPr>
-      <w:r>
-        <w:rPr>
-          <w:rFonts w:ascii="Times New Roman" w:cs="Times New Roman" w:eastAsia="Times New Roman" w:hAnsi="Times New Roman"/>
-          <w:sz w:val="26"/>
-          <w:szCs w:val="26"/>
-        </w:rPr>
-        <w:t xml:space="preserve">Xây dựng chương trình tự kéo dãn tại nhà kèm hướng dẫn an toàn.</w:t>
+        <w:t xml:space="preserve">Liệt kê các chống chỉ định cần kiểm tra.</w:t>
+      </w:r>
+    </w:p>
+    <w:p>
+      <w:pPr>
+        <w:pStyle w:val="ListParagraph"/>
+        <w:numPr>
+          <w:ilvl w:val="0"/>
+          <w:numId w:val="2"/>
+        </w:numPr>
+        <w:spacing w:after="40" w:line="312"/>
+        <w:jc w:val="both"/>
+      </w:pPr>
+      <w:r>
+        <w:rPr>
+          <w:rFonts w:ascii="Times New Roman" w:cs="Times New Roman" w:eastAsia="Times New Roman" w:hAnsi="Times New Roman"/>
+          <w:sz w:val="26"/>
+          <w:szCs w:val="26"/>
+        </w:rPr>
+        <w:t xml:space="preserve">Lựa chọn loại kéo dãn và thông số phù hợp; giải thích.</w:t>
+      </w:r>
+    </w:p>
+    <w:p>
+      <w:pPr>
+        <w:pStyle w:val="ListParagraph"/>
+        <w:numPr>
+          <w:ilvl w:val="0"/>
+          <w:numId w:val="2"/>
+        </w:numPr>
+        <w:spacing w:after="40" w:line="312"/>
+        <w:jc w:val="both"/>
+      </w:pPr>
+      <w:r>
+        <w:rPr>
+          <w:rFonts w:ascii="Times New Roman" w:cs="Times New Roman" w:eastAsia="Times New Roman" w:hAnsi="Times New Roman"/>
+          <w:sz w:val="26"/>
+          <w:szCs w:val="26"/>
+        </w:rPr>
+        <w:t xml:space="preserve">Trình bày các bước thực hiện kỹ thuật: chào hỏi, giao tiếp, kiểm tra thông tin người bệnh; hướng dẫn, giải thích kỹ thuật; đặt tư thế người bệnh và tư thế kỹ thuật viên; bộc lộ vùng điều trị; thực hiện kỹ thuật; theo dõi và xử trí khi người bệnh phản hồi cảm giác; kết thúc điều trị.</w:t>
       </w:r>
     </w:p>
     <w:p>
@@ -12607,7 +12377,7 @@
                 <w:sz w:val="26"/>
                 <w:szCs w:val="26"/>
               </w:rPr>
-              <w:t xml:space="preserve">50 phút</w:t>
+              <w:t xml:space="preserve">60 phút</w:t>
             </w:r>
           </w:p>
         </w:tc>
@@ -12646,7 +12416,7 @@
                 <w:sz w:val="26"/>
                 <w:szCs w:val="26"/>
               </w:rPr>
-              <w:t xml:space="preserve">3. Chẩn đoán điện</w:t>
+              <w:t xml:space="preserve">3. Các dòng điện giảm đau</w:t>
             </w:r>
           </w:p>
         </w:tc>
@@ -12678,7 +12448,21 @@
                 <w:sz w:val="26"/>
                 <w:szCs w:val="26"/>
               </w:rPr>
-              <w:t xml:space="preserve">- Thuyết giảng: hoạt động điện của các dây thần kinh; điện chẩn đoán.</w:t>
+              <w:t xml:space="preserve">- Thuyết giảng kết hợp phim: dòng siêu kích thích điện; dòng TENS; dòng Diadynamic; dòng giao thoa.</w:t>
+            </w:r>
+          </w:p>
+          <w:p>
+            <w:pPr>
+              <w:spacing w:after="30" w:line="276"/>
+              <w:jc w:val="left"/>
+            </w:pPr>
+            <w:r>
+              <w:rPr>
+                <w:rFonts w:ascii="Times New Roman" w:cs="Times New Roman" w:eastAsia="Times New Roman" w:hAnsi="Times New Roman"/>
+                <w:sz w:val="26"/>
+                <w:szCs w:val="26"/>
+              </w:rPr>
+              <w:t xml:space="preserve">- Trò chơi câu trả lời tiếp sức: ghép dòng điện với tác dụng điều trị.</w:t>
             </w:r>
           </w:p>
         </w:tc>
@@ -12710,7 +12494,7 @@
                 <w:sz w:val="26"/>
                 <w:szCs w:val="26"/>
               </w:rPr>
-              <w:t xml:space="preserve">25 phút</w:t>
+              <w:t xml:space="preserve">60 phút</w:t>
             </w:r>
           </w:p>
         </w:tc>
@@ -12749,124 +12533,7 @@
                 <w:sz w:val="26"/>
                 <w:szCs w:val="26"/>
               </w:rPr>
-              <w:t xml:space="preserve">4. Các dòng điện giảm đau</w:t>
-            </w:r>
-          </w:p>
-        </w:tc>
-        <w:tc>
-          <w:tcPr>
-            <w:tcW w:type="dxa" w:w="5671"/>
-            <w:tcBorders>
-              <w:top w:val="single" w:color="000000" w:sz="4"/>
-              <w:left w:val="single" w:color="000000" w:sz="4"/>
-              <w:bottom w:val="single" w:color="000000" w:sz="4"/>
-              <w:right w:val="single" w:color="000000" w:sz="4"/>
-            </w:tcBorders>
-            <w:tcMar>
-              <w:top w:type="dxa" w:w="50"/>
-              <w:left w:type="dxa" w:w="90"/>
-              <w:bottom w:type="dxa" w:w="50"/>
-              <w:right w:type="dxa" w:w="90"/>
-            </w:tcMar>
-            <w:vAlign w:val="top"/>
-          </w:tcPr>
-          <w:p>
-            <w:pPr>
-              <w:spacing w:after="30" w:line="276"/>
-              <w:jc w:val="left"/>
-            </w:pPr>
-            <w:r>
-              <w:rPr>
-                <w:rFonts w:ascii="Times New Roman" w:cs="Times New Roman" w:eastAsia="Times New Roman" w:hAnsi="Times New Roman"/>
-                <w:sz w:val="26"/>
-                <w:szCs w:val="26"/>
-              </w:rPr>
-              <w:t xml:space="preserve">- Thuyết giảng kết hợp phim: dòng siêu kích thích điện; dòng TENS; dòng Diadynamic; dòng giao thoa.</w:t>
-            </w:r>
-          </w:p>
-          <w:p>
-            <w:pPr>
-              <w:spacing w:after="30" w:line="276"/>
-              <w:jc w:val="left"/>
-            </w:pPr>
-            <w:r>
-              <w:rPr>
-                <w:rFonts w:ascii="Times New Roman" w:cs="Times New Roman" w:eastAsia="Times New Roman" w:hAnsi="Times New Roman"/>
-                <w:sz w:val="26"/>
-                <w:szCs w:val="26"/>
-              </w:rPr>
-              <w:t xml:space="preserve">- Trò chơi câu trả lời tiếp sức: ghép dòng điện với tác dụng điều trị.</w:t>
-            </w:r>
-          </w:p>
-        </w:tc>
-        <w:tc>
-          <w:tcPr>
-            <w:tcW w:type="dxa" w:w="1100"/>
-            <w:tcBorders>
-              <w:top w:val="single" w:color="000000" w:sz="4"/>
-              <w:left w:val="single" w:color="000000" w:sz="4"/>
-              <w:bottom w:val="single" w:color="000000" w:sz="4"/>
-              <w:right w:val="single" w:color="000000" w:sz="4"/>
-            </w:tcBorders>
-            <w:tcMar>
-              <w:top w:type="dxa" w:w="50"/>
-              <w:left w:type="dxa" w:w="90"/>
-              <w:bottom w:type="dxa" w:w="50"/>
-              <w:right w:type="dxa" w:w="90"/>
-            </w:tcMar>
-            <w:vAlign w:val="center"/>
-          </w:tcPr>
-          <w:p>
-            <w:pPr>
-              <w:spacing w:after="30" w:line="276"/>
-              <w:jc w:val="center"/>
-            </w:pPr>
-            <w:r>
-              <w:rPr>
-                <w:rFonts w:ascii="Times New Roman" w:cs="Times New Roman" w:eastAsia="Times New Roman" w:hAnsi="Times New Roman"/>
-                <w:sz w:val="26"/>
-                <w:szCs w:val="26"/>
-              </w:rPr>
-              <w:t xml:space="preserve">45 phút</w:t>
-            </w:r>
-          </w:p>
-        </w:tc>
-      </w:tr>
-      <w:tr>
-        <w:trPr>
-          <w:cantSplit/>
-        </w:trPr>
-        <w:tc>
-          <w:tcPr>
-            <w:tcW w:type="dxa" w:w="2300"/>
-            <w:tcBorders>
-              <w:top w:val="single" w:color="000000" w:sz="4"/>
-              <w:left w:val="single" w:color="000000" w:sz="4"/>
-              <w:bottom w:val="single" w:color="000000" w:sz="4"/>
-              <w:right w:val="single" w:color="000000" w:sz="4"/>
-            </w:tcBorders>
-            <w:tcMar>
-              <w:top w:type="dxa" w:w="50"/>
-              <w:left w:type="dxa" w:w="90"/>
-              <w:bottom w:type="dxa" w:w="50"/>
-              <w:right w:type="dxa" w:w="90"/>
-            </w:tcMar>
-            <w:vAlign w:val="top"/>
-          </w:tcPr>
-          <w:p>
-            <w:pPr>
-              <w:spacing w:after="30" w:line="276"/>
-              <w:jc w:val="left"/>
-            </w:pPr>
-            <w:r>
-              <w:rPr>
-                <w:rFonts w:ascii="Times New Roman" w:cs="Times New Roman" w:eastAsia="Times New Roman" w:hAnsi="Times New Roman"/>
-                <w:b/>
-                <w:bCs/>
-                <w:sz w:val="26"/>
-                <w:szCs w:val="26"/>
-              </w:rPr>
-              <w:t xml:space="preserve">5. Tổng kết và Lượng giá tại lớp</w:t>
+              <w:t xml:space="preserve">4. Tổng kết và Lượng giá tại lớp</w:t>
             </w:r>
           </w:p>
         </w:tc>
@@ -14390,64 +14057,45 @@
           <w:sz w:val="26"/>
           <w:szCs w:val="26"/>
         </w:rPr>
-        <w:t xml:space="preserve">Soạn slide trình chiếu nội dung bài học.</w:t>
-      </w:r>
-    </w:p>
-    <w:p>
-      <w:pPr>
-        <w:pStyle w:val="ListParagraph"/>
-        <w:numPr>
-          <w:ilvl w:val="0"/>
-          <w:numId w:val="2"/>
-        </w:numPr>
-        <w:spacing w:after="40" w:line="312"/>
-        <w:jc w:val="both"/>
-      </w:pPr>
-      <w:r>
-        <w:rPr>
-          <w:rFonts w:ascii="Times New Roman" w:cs="Times New Roman" w:eastAsia="Times New Roman" w:hAnsi="Times New Roman"/>
-          <w:sz w:val="26"/>
-          <w:szCs w:val="26"/>
-        </w:rPr>
-        <w:t xml:space="preserve">Chuẩn bị video các thao tác xoa bóp; khăn, dầu để làm mẫu nhanh.</w:t>
-      </w:r>
-    </w:p>
-    <w:p>
-      <w:pPr>
-        <w:pStyle w:val="ListParagraph"/>
-        <w:numPr>
-          <w:ilvl w:val="0"/>
-          <w:numId w:val="2"/>
-        </w:numPr>
-        <w:spacing w:after="40" w:line="312"/>
-        <w:jc w:val="both"/>
-      </w:pPr>
-      <w:r>
-        <w:rPr>
-          <w:rFonts w:ascii="Times New Roman" w:cs="Times New Roman" w:eastAsia="Times New Roman" w:hAnsi="Times New Roman"/>
-          <w:sz w:val="26"/>
-          <w:szCs w:val="26"/>
-        </w:rPr>
-        <w:t xml:space="preserve">Chuẩn bị 01 tình huống lâm sàng cho thảo luận nhóm.</w:t>
-      </w:r>
-    </w:p>
-    <w:p>
-      <w:pPr>
-        <w:pStyle w:val="ListParagraph"/>
-        <w:numPr>
-          <w:ilvl w:val="0"/>
-          <w:numId w:val="2"/>
-        </w:numPr>
-        <w:spacing w:after="40" w:line="312"/>
-        <w:jc w:val="both"/>
-      </w:pPr>
-      <w:r>
-        <w:rPr>
-          <w:rFonts w:ascii="Times New Roman" w:cs="Times New Roman" w:eastAsia="Times New Roman" w:hAnsi="Times New Roman"/>
-          <w:sz w:val="26"/>
-          <w:szCs w:val="26"/>
-        </w:rPr>
-        <w:t xml:space="preserve">Thiết lập bộ câu hỏi lượng giá nhanh.</w:t>
+        <w:t xml:space="preserve">Soạn slide trình chiếu (powerpoint) có hình ảnh, phim minh họa.</w:t>
+      </w:r>
+    </w:p>
+    <w:p>
+      <w:pPr>
+        <w:pStyle w:val="ListParagraph"/>
+        <w:numPr>
+          <w:ilvl w:val="0"/>
+          <w:numId w:val="2"/>
+        </w:numPr>
+        <w:spacing w:after="40" w:line="312"/>
+        <w:jc w:val="both"/>
+      </w:pPr>
+      <w:r>
+        <w:rPr>
+          <w:rFonts w:ascii="Times New Roman" w:cs="Times New Roman" w:eastAsia="Times New Roman" w:hAnsi="Times New Roman"/>
+          <w:sz w:val="26"/>
+          <w:szCs w:val="26"/>
+        </w:rPr>
+        <w:t xml:space="preserve">Chuẩn bị câu hỏi mở và trò chơi động não (trả lời nhanh, sơ đồ tư duy).</w:t>
+      </w:r>
+    </w:p>
+    <w:p>
+      <w:pPr>
+        <w:pStyle w:val="ListParagraph"/>
+        <w:numPr>
+          <w:ilvl w:val="0"/>
+          <w:numId w:val="2"/>
+        </w:numPr>
+        <w:spacing w:after="40" w:line="312"/>
+        <w:jc w:val="both"/>
+      </w:pPr>
+      <w:r>
+        <w:rPr>
+          <w:rFonts w:ascii="Times New Roman" w:cs="Times New Roman" w:eastAsia="Times New Roman" w:hAnsi="Times New Roman"/>
+          <w:sz w:val="26"/>
+          <w:szCs w:val="26"/>
+        </w:rPr>
+        <w:t xml:space="preserve">Chuẩn bị bài tập nhóm/nghiên cứu tình huống.</w:t>
       </w:r>
     </w:p>
     <w:p>
@@ -14500,7 +14148,7 @@
           <w:sz w:val="26"/>
           <w:szCs w:val="26"/>
         </w:rPr>
-        <w:t xml:space="preserve">Suy nghĩ về các ứng dụng thực tế (đặc biệt các trường hợp không được xoa bóp).</w:t>
+        <w:t xml:space="preserve">Lên danh sách các bệnh/tình trạng được chỉ định xoa bóp.</w:t>
       </w:r>
     </w:p>
     <w:p>
@@ -14531,7 +14179,7 @@
           <w:sz w:val="26"/>
           <w:szCs w:val="26"/>
         </w:rPr>
-        <w:t xml:space="preserve">Máy chiếu, bảng, bút viết, laptop, slide trình chiếu, loa; khăn, dầu xoa bóp.</w:t>
+        <w:t xml:space="preserve">Máy chiếu, bảng, phấn/bút viết, laptop, slide trình chiếu có hình ảnh, phim.</w:t>
       </w:r>
     </w:p>
     <w:p>
@@ -14774,7 +14422,7 @@
                 <w:sz w:val="26"/>
                 <w:szCs w:val="26"/>
               </w:rPr>
-              <w:t xml:space="preserve">- Kích thích tư duy: giảng viên làm mẫu thao tác vuốt cẳng tay trên một sinh viên, hỏi cảm nhận.</w:t>
+              <w:t xml:space="preserve">- Câu hỏi mở về vai trò của xoa bóp trong vật lý trị liệu.</w:t>
             </w:r>
           </w:p>
           <w:p>
@@ -14859,7 +14507,7 @@
                 <w:sz w:val="26"/>
                 <w:szCs w:val="26"/>
               </w:rPr>
-              <w:t xml:space="preserve">2. Khái niệm, tác dụng sinh lý và điều trị</w:t>
+              <w:t xml:space="preserve">2. Khái niệm, tác dụng sinh lý và tác dụng điều trị</w:t>
             </w:r>
           </w:p>
         </w:tc>
@@ -14891,21 +14539,7 @@
                 <w:sz w:val="26"/>
                 <w:szCs w:val="26"/>
               </w:rPr>
-              <w:t xml:space="preserve">- Thuyết giảng tích cực: tác dụng cơ học, phản xạ, tuần hoàn, thần kinh, tâm lý.</w:t>
-            </w:r>
-          </w:p>
-          <w:p>
-            <w:pPr>
-              <w:spacing w:after="30" w:line="276"/>
-              <w:jc w:val="left"/>
-            </w:pPr>
-            <w:r>
-              <w:rPr>
-                <w:rFonts w:ascii="Times New Roman" w:cs="Times New Roman" w:eastAsia="Times New Roman" w:hAnsi="Times New Roman"/>
-                <w:sz w:val="26"/>
-                <w:szCs w:val="26"/>
-              </w:rPr>
-              <w:t xml:space="preserve">- Thảo luận nhóm đôi (2 phút): “Vì sao thao tác vuốt phải theo hướng về tim?”</w:t>
+              <w:t xml:space="preserve">- Thuyết giảng tích cực (powerpoint, hình ảnh).</w:t>
             </w:r>
           </w:p>
         </w:tc>
@@ -14976,7 +14610,7 @@
                 <w:sz w:val="26"/>
                 <w:szCs w:val="26"/>
               </w:rPr>
-              <w:t xml:space="preserve">3. Chỉ định, chống chỉ định, nguyên tắc áp dụng</w:t>
+              <w:t xml:space="preserve">3. Chỉ định, chống chỉ định và nguyên tắc áp dụng</w:t>
             </w:r>
           </w:p>
         </w:tc>
@@ -15008,21 +14642,7 @@
                 <w:sz w:val="26"/>
                 <w:szCs w:val="26"/>
               </w:rPr>
-              <w:t xml:space="preserve">- Thuyết giảng: chỉ định, chống chỉ định; nguyên tắc tư thế – hướng – lực – nhịp độ – thời gian.</w:t>
-            </w:r>
-          </w:p>
-          <w:p>
-            <w:pPr>
-              <w:spacing w:after="30" w:line="276"/>
-              <w:jc w:val="left"/>
-            </w:pPr>
-            <w:r>
-              <w:rPr>
-                <w:rFonts w:ascii="Times New Roman" w:cs="Times New Roman" w:eastAsia="Times New Roman" w:hAnsi="Times New Roman"/>
-                <w:sz w:val="26"/>
-                <w:szCs w:val="26"/>
-              </w:rPr>
-              <w:t xml:space="preserve">- Câu hỏi động não: các “cờ đỏ” không được xoa bóp.</w:t>
+              <w:t xml:space="preserve">- Thuyết giảng; trò chơi động não: phân loại chỉ định/chống chỉ định.</w:t>
             </w:r>
           </w:p>
         </w:tc>
@@ -15054,7 +14674,7 @@
                 <w:sz w:val="26"/>
                 <w:szCs w:val="26"/>
               </w:rPr>
-              <w:t xml:space="preserve">20 phút</w:t>
+              <w:t xml:space="preserve">25 phút</w:t>
             </w:r>
           </w:p>
         </w:tc>
@@ -15093,7 +14713,7 @@
                 <w:sz w:val="26"/>
                 <w:szCs w:val="26"/>
               </w:rPr>
-              <w:t xml:space="preserve">4. Các thao tác cơ bản và quy trình</w:t>
+              <w:t xml:space="preserve">4. Các thao tác xoa bóp cơ bản và quy trình</w:t>
             </w:r>
           </w:p>
         </w:tc>
@@ -15125,7 +14745,7 @@
                 <w:sz w:val="26"/>
                 <w:szCs w:val="26"/>
               </w:rPr>
-              <w:t xml:space="preserve">- Làm mẫu: giảng viên thực hiện nhanh 5 thao tác; sinh viên quan sát và ghi đặc điểm từng thao tác.</w:t>
+              <w:t xml:space="preserve">- Thuyết giảng kết hợp phim minh họa.</w:t>
             </w:r>
           </w:p>
           <w:p>
@@ -15139,7 +14759,7 @@
                 <w:sz w:val="26"/>
                 <w:szCs w:val="26"/>
               </w:rPr>
-              <w:t xml:space="preserve">- Video quy trình xoa bóp một vùng.</w:t>
+              <w:t xml:space="preserve">- Học nhóm – nghiên cứu tình huống: lựa chọn thao tác cho bệnh nhân giả định; đại diện trình bày.</w:t>
             </w:r>
           </w:p>
         </w:tc>
@@ -15171,7 +14791,7 @@
                 <w:sz w:val="26"/>
                 <w:szCs w:val="26"/>
               </w:rPr>
-              <w:t xml:space="preserve">25 phút</w:t>
+              <w:t xml:space="preserve">35 phút</w:t>
             </w:r>
           </w:p>
         </w:tc>
@@ -15210,7 +14830,7 @@
                 <w:sz w:val="26"/>
                 <w:szCs w:val="26"/>
               </w:rPr>
-              <w:t xml:space="preserve">5. Dạy học dựa trên tình huống (CBL)</w:t>
+              <w:t xml:space="preserve">5. Tổng kết và Lượng giá tại lớp</w:t>
             </w:r>
           </w:p>
         </w:tc>
@@ -15242,7 +14862,21 @@
                 <w:sz w:val="26"/>
                 <w:szCs w:val="26"/>
               </w:rPr>
-              <w:t xml:space="preserve">- Ca lâm sàng phù nề cẳng chân sau tháo bột: nhóm xác định mục tiêu, chọn thao tác và trình tự; giảng viên phản hồi.</w:t>
+              <w:t xml:space="preserve">- Tóm tắt bằng sơ đồ tư duy; câu hỏi nhanh.</w:t>
+            </w:r>
+          </w:p>
+          <w:p>
+            <w:pPr>
+              <w:spacing w:after="30" w:line="276"/>
+              <w:jc w:val="left"/>
+            </w:pPr>
+            <w:r>
+              <w:rPr>
+                <w:rFonts w:ascii="Times New Roman" w:cs="Times New Roman" w:eastAsia="Times New Roman" w:hAnsi="Times New Roman"/>
+                <w:sz w:val="26"/>
+                <w:szCs w:val="26"/>
+              </w:rPr>
+              <w:t xml:space="preserve">- Dặn dò xem lại quy trình trước buổi thực hành.</w:t>
             </w:r>
           </w:p>
         </w:tc>
@@ -15274,123 +14908,6 @@
                 <w:sz w:val="26"/>
                 <w:szCs w:val="26"/>
               </w:rPr>
-              <w:t xml:space="preserve">15 phút</w:t>
-            </w:r>
-          </w:p>
-        </w:tc>
-      </w:tr>
-      <w:tr>
-        <w:trPr>
-          <w:cantSplit/>
-        </w:trPr>
-        <w:tc>
-          <w:tcPr>
-            <w:tcW w:type="dxa" w:w="2300"/>
-            <w:tcBorders>
-              <w:top w:val="single" w:color="000000" w:sz="4"/>
-              <w:left w:val="single" w:color="000000" w:sz="4"/>
-              <w:bottom w:val="single" w:color="000000" w:sz="4"/>
-              <w:right w:val="single" w:color="000000" w:sz="4"/>
-            </w:tcBorders>
-            <w:tcMar>
-              <w:top w:type="dxa" w:w="50"/>
-              <w:left w:type="dxa" w:w="90"/>
-              <w:bottom w:type="dxa" w:w="50"/>
-              <w:right w:type="dxa" w:w="90"/>
-            </w:tcMar>
-            <w:vAlign w:val="top"/>
-          </w:tcPr>
-          <w:p>
-            <w:pPr>
-              <w:spacing w:after="30" w:line="276"/>
-              <w:jc w:val="left"/>
-            </w:pPr>
-            <w:r>
-              <w:rPr>
-                <w:rFonts w:ascii="Times New Roman" w:cs="Times New Roman" w:eastAsia="Times New Roman" w:hAnsi="Times New Roman"/>
-                <w:b/>
-                <w:bCs/>
-                <w:sz w:val="26"/>
-                <w:szCs w:val="26"/>
-              </w:rPr>
-              <w:t xml:space="preserve">6. Tổng kết và Lượng giá tại lớp</w:t>
-            </w:r>
-          </w:p>
-        </w:tc>
-        <w:tc>
-          <w:tcPr>
-            <w:tcW w:type="dxa" w:w="5671"/>
-            <w:tcBorders>
-              <w:top w:val="single" w:color="000000" w:sz="4"/>
-              <w:left w:val="single" w:color="000000" w:sz="4"/>
-              <w:bottom w:val="single" w:color="000000" w:sz="4"/>
-              <w:right w:val="single" w:color="000000" w:sz="4"/>
-            </w:tcBorders>
-            <w:tcMar>
-              <w:top w:type="dxa" w:w="50"/>
-              <w:left w:type="dxa" w:w="90"/>
-              <w:bottom w:type="dxa" w:w="50"/>
-              <w:right w:type="dxa" w:w="90"/>
-            </w:tcMar>
-            <w:vAlign w:val="top"/>
-          </w:tcPr>
-          <w:p>
-            <w:pPr>
-              <w:spacing w:after="30" w:line="276"/>
-              <w:jc w:val="left"/>
-            </w:pPr>
-            <w:r>
-              <w:rPr>
-                <w:rFonts w:ascii="Times New Roman" w:cs="Times New Roman" w:eastAsia="Times New Roman" w:hAnsi="Times New Roman"/>
-                <w:sz w:val="26"/>
-                <w:szCs w:val="26"/>
-              </w:rPr>
-              <w:t xml:space="preserve">- Tóm tắt; lượng giá nhanh 3 câu MCQ.</w:t>
-            </w:r>
-          </w:p>
-          <w:p>
-            <w:pPr>
-              <w:spacing w:after="30" w:line="276"/>
-              <w:jc w:val="left"/>
-            </w:pPr>
-            <w:r>
-              <w:rPr>
-                <w:rFonts w:ascii="Times New Roman" w:cs="Times New Roman" w:eastAsia="Times New Roman" w:hAnsi="Times New Roman"/>
-                <w:sz w:val="26"/>
-                <w:szCs w:val="26"/>
-              </w:rPr>
-              <w:t xml:space="preserve">- Dặn dò cắt ngắn móng tay, chuẩn bị trang phục thực hành.</w:t>
-            </w:r>
-          </w:p>
-        </w:tc>
-        <w:tc>
-          <w:tcPr>
-            <w:tcW w:type="dxa" w:w="1100"/>
-            <w:tcBorders>
-              <w:top w:val="single" w:color="000000" w:sz="4"/>
-              <w:left w:val="single" w:color="000000" w:sz="4"/>
-              <w:bottom w:val="single" w:color="000000" w:sz="4"/>
-              <w:right w:val="single" w:color="000000" w:sz="4"/>
-            </w:tcBorders>
-            <w:tcMar>
-              <w:top w:type="dxa" w:w="50"/>
-              <w:left w:type="dxa" w:w="90"/>
-              <w:bottom w:type="dxa" w:w="50"/>
-              <w:right w:type="dxa" w:w="90"/>
-            </w:tcMar>
-            <w:vAlign w:val="center"/>
-          </w:tcPr>
-          <w:p>
-            <w:pPr>
-              <w:spacing w:after="30" w:line="276"/>
-              <w:jc w:val="center"/>
-            </w:pPr>
-            <w:r>
-              <w:rPr>
-                <w:rFonts w:ascii="Times New Roman" w:cs="Times New Roman" w:eastAsia="Times New Roman" w:hAnsi="Times New Roman"/>
-                <w:sz w:val="26"/>
-                <w:szCs w:val="26"/>
-              </w:rPr>
               <w:t xml:space="preserve">10 phút</w:t>
             </w:r>
           </w:p>
@@ -15740,64 +15257,45 @@
           <w:sz w:val="26"/>
           <w:szCs w:val="26"/>
         </w:rPr>
-        <w:t xml:space="preserve">Soạn slide trình chiếu (bản đồ đau quy chiếu các cơ chính, hình ảnh dải cơ căng).</w:t>
-      </w:r>
-    </w:p>
-    <w:p>
-      <w:pPr>
-        <w:pStyle w:val="ListParagraph"/>
-        <w:numPr>
-          <w:ilvl w:val="0"/>
-          <w:numId w:val="2"/>
-        </w:numPr>
-        <w:spacing w:after="40" w:line="312"/>
-        <w:jc w:val="both"/>
-      </w:pPr>
-      <w:r>
-        <w:rPr>
-          <w:rFonts w:ascii="Times New Roman" w:cs="Times New Roman" w:eastAsia="Times New Roman" w:hAnsi="Times New Roman"/>
-          <w:sz w:val="26"/>
-          <w:szCs w:val="26"/>
-        </w:rPr>
-        <w:t xml:space="preserve">Chuẩn bị video kỹ thuật sờ dẹt, sờ kẹp, nén – day và trượt dọc theo thớ cơ.</w:t>
-      </w:r>
-    </w:p>
-    <w:p>
-      <w:pPr>
-        <w:pStyle w:val="ListParagraph"/>
-        <w:numPr>
-          <w:ilvl w:val="0"/>
-          <w:numId w:val="2"/>
-        </w:numPr>
-        <w:spacing w:after="40" w:line="312"/>
-        <w:jc w:val="both"/>
-      </w:pPr>
-      <w:r>
-        <w:rPr>
-          <w:rFonts w:ascii="Times New Roman" w:cs="Times New Roman" w:eastAsia="Times New Roman" w:hAnsi="Times New Roman"/>
-          <w:sz w:val="26"/>
-          <w:szCs w:val="26"/>
-        </w:rPr>
-        <w:t xml:space="preserve">Chuẩn bị 02 tình huống lâm sàng ngắn.</w:t>
-      </w:r>
-    </w:p>
-    <w:p>
-      <w:pPr>
-        <w:pStyle w:val="ListParagraph"/>
-        <w:numPr>
-          <w:ilvl w:val="0"/>
-          <w:numId w:val="2"/>
-        </w:numPr>
-        <w:spacing w:after="40" w:line="312"/>
-        <w:jc w:val="both"/>
-      </w:pPr>
-      <w:r>
-        <w:rPr>
-          <w:rFonts w:ascii="Times New Roman" w:cs="Times New Roman" w:eastAsia="Times New Roman" w:hAnsi="Times New Roman"/>
-          <w:sz w:val="26"/>
-          <w:szCs w:val="26"/>
-        </w:rPr>
-        <w:t xml:space="preserve">Thiết lập bộ câu hỏi lượng giá nhanh.</w:t>
+        <w:t xml:space="preserve">Soạn slide trình chiếu (powerpoint) có hình ảnh, phim minh họa.</w:t>
+      </w:r>
+    </w:p>
+    <w:p>
+      <w:pPr>
+        <w:pStyle w:val="ListParagraph"/>
+        <w:numPr>
+          <w:ilvl w:val="0"/>
+          <w:numId w:val="2"/>
+        </w:numPr>
+        <w:spacing w:after="40" w:line="312"/>
+        <w:jc w:val="both"/>
+      </w:pPr>
+      <w:r>
+        <w:rPr>
+          <w:rFonts w:ascii="Times New Roman" w:cs="Times New Roman" w:eastAsia="Times New Roman" w:hAnsi="Times New Roman"/>
+          <w:sz w:val="26"/>
+          <w:szCs w:val="26"/>
+        </w:rPr>
+        <w:t xml:space="preserve">Chuẩn bị câu hỏi mở và trò chơi động não (trả lời nhanh, sơ đồ tư duy).</w:t>
+      </w:r>
+    </w:p>
+    <w:p>
+      <w:pPr>
+        <w:pStyle w:val="ListParagraph"/>
+        <w:numPr>
+          <w:ilvl w:val="0"/>
+          <w:numId w:val="2"/>
+        </w:numPr>
+        <w:spacing w:after="40" w:line="312"/>
+        <w:jc w:val="both"/>
+      </w:pPr>
+      <w:r>
+        <w:rPr>
+          <w:rFonts w:ascii="Times New Roman" w:cs="Times New Roman" w:eastAsia="Times New Roman" w:hAnsi="Times New Roman"/>
+          <w:sz w:val="26"/>
+          <w:szCs w:val="26"/>
+        </w:rPr>
+        <w:t xml:space="preserve">Chuẩn bị bài tập nhóm/nghiên cứu tình huống.</w:t>
       </w:r>
     </w:p>
     <w:p>
@@ -15850,7 +15348,7 @@
           <w:sz w:val="26"/>
           <w:szCs w:val="26"/>
         </w:rPr>
-        <w:t xml:space="preserve">Suy nghĩ về các ứng dụng thực tế (liên hệ đau cổ vai ở người làm việc văn phòng).</w:t>
+        <w:t xml:space="preserve">Ôn lại giải phẫu các nhóm cơ chính.</w:t>
       </w:r>
     </w:p>
     <w:p>
@@ -15881,7 +15379,7 @@
           <w:sz w:val="26"/>
           <w:szCs w:val="26"/>
         </w:rPr>
-        <w:t xml:space="preserve">Máy chiếu, bảng, bút viết, laptop, slide trình chiếu, loa; mô hình giải phẫu cơ vùng cổ vai.</w:t>
+        <w:t xml:space="preserve">Máy chiếu, bảng, phấn/bút viết, laptop, slide trình chiếu có hình ảnh, phim.</w:t>
       </w:r>
     </w:p>
     <w:p>
@@ -16124,7 +15622,7 @@
                 <w:sz w:val="26"/>
                 <w:szCs w:val="26"/>
               </w:rPr>
-              <w:t xml:space="preserve">- Kích thích tư duy: sinh viên tự sờ bờ trên cơ thang, tìm điểm đau và mô tả cảm giác.</w:t>
+              <w:t xml:space="preserve">- Câu hỏi mở về điểm đau trong cơ.</w:t>
             </w:r>
           </w:p>
           <w:p>
@@ -16241,35 +15739,7 @@
                 <w:sz w:val="26"/>
                 <w:szCs w:val="26"/>
               </w:rPr>
-              <w:t xml:space="preserve">- Thuyết giảng tích cực: định nghĩa, phân loại, giả thuyết hình thành; tiêu chuẩn xác định.</w:t>
-            </w:r>
-          </w:p>
-          <w:p>
-            <w:pPr>
-              <w:spacing w:after="30" w:line="276"/>
-              <w:jc w:val="left"/>
-            </w:pPr>
-            <w:r>
-              <w:rPr>
-                <w:rFonts w:ascii="Times New Roman" w:cs="Times New Roman" w:eastAsia="Times New Roman" w:hAnsi="Times New Roman"/>
-                <w:sz w:val="26"/>
-                <w:szCs w:val="26"/>
-              </w:rPr>
-              <w:t xml:space="preserve">- Video: kỹ thuật sờ dẹt, sờ kẹp.</w:t>
-            </w:r>
-          </w:p>
-          <w:p>
-            <w:pPr>
-              <w:spacing w:after="30" w:line="276"/>
-              <w:jc w:val="left"/>
-            </w:pPr>
-            <w:r>
-              <w:rPr>
-                <w:rFonts w:ascii="Times New Roman" w:cs="Times New Roman" w:eastAsia="Times New Roman" w:hAnsi="Times New Roman"/>
-                <w:sz w:val="26"/>
-                <w:szCs w:val="26"/>
-              </w:rPr>
-              <w:t xml:space="preserve">- Câu hỏi động não: nhận diện cơ từ bản đồ đau quy chiếu.</w:t>
+              <w:t xml:space="preserve">- Thuyết giảng tích cực (powerpoint, hình ảnh).</w:t>
             </w:r>
           </w:p>
         </w:tc>
@@ -16340,7 +15810,7 @@
                 <w:sz w:val="26"/>
                 <w:szCs w:val="26"/>
               </w:rPr>
-              <w:t xml:space="preserve">3. Nén và day điểm kích hoạt</w:t>
+              <w:t xml:space="preserve">3. Cơ chế tác dụng, chỉ định, chống chỉ định, tai biến</w:t>
             </w:r>
           </w:p>
         </w:tc>
@@ -16372,21 +15842,7 @@
                 <w:sz w:val="26"/>
                 <w:szCs w:val="26"/>
               </w:rPr>
-              <w:t xml:space="preserve">- Thuyết giảng: cơ chế nén thiếu máu cục bộ; chỉ định, chống chỉ định, tai biến.</w:t>
-            </w:r>
-          </w:p>
-          <w:p>
-            <w:pPr>
-              <w:spacing w:after="30" w:line="276"/>
-              <w:jc w:val="left"/>
-            </w:pPr>
-            <w:r>
-              <w:rPr>
-                <w:rFonts w:ascii="Times New Roman" w:cs="Times New Roman" w:eastAsia="Times New Roman" w:hAnsi="Times New Roman"/>
-                <w:sz w:val="26"/>
-                <w:szCs w:val="26"/>
-              </w:rPr>
-              <w:t xml:space="preserve">- Video &amp; trực quan: quy trình nén – day; giảng viên phân tích lực tay và tiêu chí kết thúc.</w:t>
+              <w:t xml:space="preserve">- Thuyết giảng; trò chơi động não: phân loại chỉ định/chống chỉ định.</w:t>
             </w:r>
           </w:p>
         </w:tc>
@@ -16418,7 +15874,7 @@
                 <w:sz w:val="26"/>
                 <w:szCs w:val="26"/>
               </w:rPr>
-              <w:t xml:space="preserve">25 phút</w:t>
+              <w:t xml:space="preserve">20 phút</w:t>
             </w:r>
           </w:p>
         </w:tc>
@@ -16457,7 +15913,7 @@
                 <w:sz w:val="26"/>
                 <w:szCs w:val="26"/>
               </w:rPr>
-              <w:t xml:space="preserve">4. Trượt dọc theo thớ cơ</w:t>
+              <w:t xml:space="preserve">4. Kỹ thuật nén, day điểm kích hoạt và trượt dọc theo thớ cơ</w:t>
             </w:r>
           </w:p>
         </w:tc>
@@ -16489,7 +15945,7 @@
                 <w:sz w:val="26"/>
                 <w:szCs w:val="26"/>
               </w:rPr>
-              <w:t xml:space="preserve">- Thuyết giảng: cơ chế, chỉ định, chống chỉ định; phân biệt với thao tác vuốt.</w:t>
+              <w:t xml:space="preserve">- Thuyết giảng kết hợp phim minh họa.</w:t>
             </w:r>
           </w:p>
           <w:p>
@@ -16503,7 +15959,7 @@
                 <w:sz w:val="26"/>
                 <w:szCs w:val="26"/>
               </w:rPr>
-              <w:t xml:space="preserve">- Làm mẫu nhanh trên cơ cạnh sống và cơ bụng chân.</w:t>
+              <w:t xml:space="preserve">- Học nhóm – nghiên cứu tình huống: lựa chọn kỹ thuật cho bệnh nhân giả định; đại diện trình bày.</w:t>
             </w:r>
           </w:p>
         </w:tc>
@@ -16535,7 +15991,7 @@
                 <w:sz w:val="26"/>
                 <w:szCs w:val="26"/>
               </w:rPr>
-              <w:t xml:space="preserve">15 phút</w:t>
+              <w:t xml:space="preserve">40 phút</w:t>
             </w:r>
           </w:p>
         </w:tc>
@@ -16574,7 +16030,7 @@
                 <w:sz w:val="26"/>
                 <w:szCs w:val="26"/>
               </w:rPr>
-              <w:t xml:space="preserve">5. Dạy học dựa trên tình huống (CBL)</w:t>
+              <w:t xml:space="preserve">5. Tổng kết và Lượng giá tại lớp</w:t>
             </w:r>
           </w:p>
         </w:tc>
@@ -16606,7 +16062,7 @@
                 <w:sz w:val="26"/>
                 <w:szCs w:val="26"/>
               </w:rPr>
-              <w:t xml:space="preserve">- Nhóm phân tích 2 ca: đau đầu do điểm kích hoạt cơ thang trên; căng cơ bụng chân ở người chạy bộ.</w:t>
+              <w:t xml:space="preserve">- Tóm tắt bằng sơ đồ tư duy; câu hỏi nhanh.</w:t>
             </w:r>
           </w:p>
           <w:p>
@@ -16620,7 +16076,7 @@
                 <w:sz w:val="26"/>
                 <w:szCs w:val="26"/>
               </w:rPr>
-              <w:t xml:space="preserve">- Nhóm chọn kỹ thuật, mô tả cách thực hiện, đề xuất phối hợp kéo dãn; giảng viên phản hồi.</w:t>
+              <w:t xml:space="preserve">- Dặn dò xem lại quy trình trước buổi thực hành.</w:t>
             </w:r>
           </w:p>
         </w:tc>
@@ -16652,137 +16108,6 @@
                 <w:sz w:val="26"/>
                 <w:szCs w:val="26"/>
               </w:rPr>
-              <w:t xml:space="preserve">20 phút</w:t>
-            </w:r>
-          </w:p>
-        </w:tc>
-      </w:tr>
-      <w:tr>
-        <w:trPr>
-          <w:cantSplit/>
-        </w:trPr>
-        <w:tc>
-          <w:tcPr>
-            <w:tcW w:type="dxa" w:w="2300"/>
-            <w:tcBorders>
-              <w:top w:val="single" w:color="000000" w:sz="4"/>
-              <w:left w:val="single" w:color="000000" w:sz="4"/>
-              <w:bottom w:val="single" w:color="000000" w:sz="4"/>
-              <w:right w:val="single" w:color="000000" w:sz="4"/>
-            </w:tcBorders>
-            <w:tcMar>
-              <w:top w:type="dxa" w:w="50"/>
-              <w:left w:type="dxa" w:w="90"/>
-              <w:bottom w:type="dxa" w:w="50"/>
-              <w:right w:type="dxa" w:w="90"/>
-            </w:tcMar>
-            <w:vAlign w:val="top"/>
-          </w:tcPr>
-          <w:p>
-            <w:pPr>
-              <w:spacing w:after="30" w:line="276"/>
-              <w:jc w:val="left"/>
-            </w:pPr>
-            <w:r>
-              <w:rPr>
-                <w:rFonts w:ascii="Times New Roman" w:cs="Times New Roman" w:eastAsia="Times New Roman" w:hAnsi="Times New Roman"/>
-                <w:b/>
-                <w:bCs/>
-                <w:sz w:val="26"/>
-                <w:szCs w:val="26"/>
-              </w:rPr>
-              <w:t xml:space="preserve">6. Tổng kết và Lượng giá tại lớp</w:t>
-            </w:r>
-          </w:p>
-        </w:tc>
-        <w:tc>
-          <w:tcPr>
-            <w:tcW w:type="dxa" w:w="5671"/>
-            <w:tcBorders>
-              <w:top w:val="single" w:color="000000" w:sz="4"/>
-              <w:left w:val="single" w:color="000000" w:sz="4"/>
-              <w:bottom w:val="single" w:color="000000" w:sz="4"/>
-              <w:right w:val="single" w:color="000000" w:sz="4"/>
-            </w:tcBorders>
-            <w:tcMar>
-              <w:top w:type="dxa" w:w="50"/>
-              <w:left w:type="dxa" w:w="90"/>
-              <w:bottom w:type="dxa" w:w="50"/>
-              <w:right w:type="dxa" w:w="90"/>
-            </w:tcMar>
-            <w:vAlign w:val="top"/>
-          </w:tcPr>
-          <w:p>
-            <w:pPr>
-              <w:spacing w:after="30" w:line="276"/>
-              <w:jc w:val="left"/>
-            </w:pPr>
-            <w:r>
-              <w:rPr>
-                <w:rFonts w:ascii="Times New Roman" w:cs="Times New Roman" w:eastAsia="Times New Roman" w:hAnsi="Times New Roman"/>
-                <w:sz w:val="26"/>
-                <w:szCs w:val="26"/>
-              </w:rPr>
-              <w:t xml:space="preserve">- Tóm tắt từ khóa cốt lõi.</w:t>
-            </w:r>
-          </w:p>
-          <w:p>
-            <w:pPr>
-              <w:spacing w:after="30" w:line="276"/>
-              <w:jc w:val="left"/>
-            </w:pPr>
-            <w:r>
-              <w:rPr>
-                <w:rFonts w:ascii="Times New Roman" w:cs="Times New Roman" w:eastAsia="Times New Roman" w:hAnsi="Times New Roman"/>
-                <w:sz w:val="26"/>
-                <w:szCs w:val="26"/>
-              </w:rPr>
-              <w:t xml:space="preserve">- Lượng giá nhanh: 3–5 câu MCQ trên Kahoot/Slido.</w:t>
-            </w:r>
-          </w:p>
-          <w:p>
-            <w:pPr>
-              <w:spacing w:after="30" w:line="276"/>
-              <w:jc w:val="left"/>
-            </w:pPr>
-            <w:r>
-              <w:rPr>
-                <w:rFonts w:ascii="Times New Roman" w:cs="Times New Roman" w:eastAsia="Times New Roman" w:hAnsi="Times New Roman"/>
-                <w:sz w:val="26"/>
-                <w:szCs w:val="26"/>
-              </w:rPr>
-              <w:t xml:space="preserve">- Dặn dò chuẩn bị trang phục, dầu xoa bóp cho buổi thực hành.</w:t>
-            </w:r>
-          </w:p>
-        </w:tc>
-        <w:tc>
-          <w:tcPr>
-            <w:tcW w:type="dxa" w:w="1100"/>
-            <w:tcBorders>
-              <w:top w:val="single" w:color="000000" w:sz="4"/>
-              <w:left w:val="single" w:color="000000" w:sz="4"/>
-              <w:bottom w:val="single" w:color="000000" w:sz="4"/>
-              <w:right w:val="single" w:color="000000" w:sz="4"/>
-            </w:tcBorders>
-            <w:tcMar>
-              <w:top w:type="dxa" w:w="50"/>
-              <w:left w:type="dxa" w:w="90"/>
-              <w:bottom w:type="dxa" w:w="50"/>
-              <w:right w:type="dxa" w:w="90"/>
-            </w:tcMar>
-            <w:vAlign w:val="center"/>
-          </w:tcPr>
-          <w:p>
-            <w:pPr>
-              <w:spacing w:after="30" w:line="276"/>
-              <w:jc w:val="center"/>
-            </w:pPr>
-            <w:r>
-              <w:rPr>
-                <w:rFonts w:ascii="Times New Roman" w:cs="Times New Roman" w:eastAsia="Times New Roman" w:hAnsi="Times New Roman"/>
-                <w:sz w:val="26"/>
-                <w:szCs w:val="26"/>
-              </w:rPr>
               <w:t xml:space="preserve">10 phút</w:t>
             </w:r>
           </w:p>
@@ -17132,64 +16457,45 @@
           <w:sz w:val="26"/>
           <w:szCs w:val="26"/>
         </w:rPr>
-        <w:t xml:space="preserve">Soạn slide trình chiếu (suốt cơ, cơ quan gân Golgi, đồ thị creep – stress relaxation).</w:t>
-      </w:r>
-    </w:p>
-    <w:p>
-      <w:pPr>
-        <w:pStyle w:val="ListParagraph"/>
-        <w:numPr>
-          <w:ilvl w:val="0"/>
-          <w:numId w:val="2"/>
-        </w:numPr>
-        <w:spacing w:after="40" w:line="312"/>
-        <w:jc w:val="both"/>
-      </w:pPr>
-      <w:r>
-        <w:rPr>
-          <w:rFonts w:ascii="Times New Roman" w:cs="Times New Roman" w:eastAsia="Times New Roman" w:hAnsi="Times New Roman"/>
-          <w:sz w:val="26"/>
-          <w:szCs w:val="26"/>
-        </w:rPr>
-        <w:t xml:space="preserve">Chuẩn bị video kéo dãn các nhóm cơ chính.</w:t>
-      </w:r>
-    </w:p>
-    <w:p>
-      <w:pPr>
-        <w:pStyle w:val="ListParagraph"/>
-        <w:numPr>
-          <w:ilvl w:val="0"/>
-          <w:numId w:val="2"/>
-        </w:numPr>
-        <w:spacing w:after="40" w:line="312"/>
-        <w:jc w:val="both"/>
-      </w:pPr>
-      <w:r>
-        <w:rPr>
-          <w:rFonts w:ascii="Times New Roman" w:cs="Times New Roman" w:eastAsia="Times New Roman" w:hAnsi="Times New Roman"/>
-          <w:sz w:val="26"/>
-          <w:szCs w:val="26"/>
-        </w:rPr>
-        <w:t xml:space="preserve">Chuẩn bị 01 tình huống lâm sàng và câu hỏi ôn tập Phần B.</w:t>
-      </w:r>
-    </w:p>
-    <w:p>
-      <w:pPr>
-        <w:pStyle w:val="ListParagraph"/>
-        <w:numPr>
-          <w:ilvl w:val="0"/>
-          <w:numId w:val="2"/>
-        </w:numPr>
-        <w:spacing w:after="40" w:line="312"/>
-        <w:jc w:val="both"/>
-      </w:pPr>
-      <w:r>
-        <w:rPr>
-          <w:rFonts w:ascii="Times New Roman" w:cs="Times New Roman" w:eastAsia="Times New Roman" w:hAnsi="Times New Roman"/>
-          <w:sz w:val="26"/>
-          <w:szCs w:val="26"/>
-        </w:rPr>
-        <w:t xml:space="preserve">Thiết lập bộ câu hỏi lượng giá nhanh.</w:t>
+        <w:t xml:space="preserve">Soạn slide trình chiếu (powerpoint) có hình ảnh, phim minh họa.</w:t>
+      </w:r>
+    </w:p>
+    <w:p>
+      <w:pPr>
+        <w:pStyle w:val="ListParagraph"/>
+        <w:numPr>
+          <w:ilvl w:val="0"/>
+          <w:numId w:val="2"/>
+        </w:numPr>
+        <w:spacing w:after="40" w:line="312"/>
+        <w:jc w:val="both"/>
+      </w:pPr>
+      <w:r>
+        <w:rPr>
+          <w:rFonts w:ascii="Times New Roman" w:cs="Times New Roman" w:eastAsia="Times New Roman" w:hAnsi="Times New Roman"/>
+          <w:sz w:val="26"/>
+          <w:szCs w:val="26"/>
+        </w:rPr>
+        <w:t xml:space="preserve">Chuẩn bị câu hỏi mở và trò chơi động não (trả lời nhanh, sơ đồ tư duy).</w:t>
+      </w:r>
+    </w:p>
+    <w:p>
+      <w:pPr>
+        <w:pStyle w:val="ListParagraph"/>
+        <w:numPr>
+          <w:ilvl w:val="0"/>
+          <w:numId w:val="2"/>
+        </w:numPr>
+        <w:spacing w:after="40" w:line="312"/>
+        <w:jc w:val="both"/>
+      </w:pPr>
+      <w:r>
+        <w:rPr>
+          <w:rFonts w:ascii="Times New Roman" w:cs="Times New Roman" w:eastAsia="Times New Roman" w:hAnsi="Times New Roman"/>
+          <w:sz w:val="26"/>
+          <w:szCs w:val="26"/>
+        </w:rPr>
+        <w:t xml:space="preserve">Chuẩn bị bài tập nhóm/nghiên cứu tình huống.</w:t>
       </w:r>
     </w:p>
     <w:p>
@@ -17242,7 +16548,7 @@
           <w:sz w:val="26"/>
           <w:szCs w:val="26"/>
         </w:rPr>
-        <w:t xml:space="preserve">Suy nghĩ về các ứng dụng thực tế (đặc biệt sai lầm khi kéo dãn nảy, kéo khi cơ còn lạnh).</w:t>
+        <w:t xml:space="preserve">Ôn lại giải phẫu các nhóm cơ chính.</w:t>
       </w:r>
     </w:p>
     <w:p>
@@ -17273,7 +16579,7 @@
           <w:sz w:val="26"/>
           <w:szCs w:val="26"/>
         </w:rPr>
-        <w:t xml:space="preserve">Máy chiếu, bảng, bút viết, laptop, slide trình chiếu, loa; thước đo góc.</w:t>
+        <w:t xml:space="preserve">Máy chiếu, bảng, phấn/bút viết, laptop, slide trình chiếu có hình ảnh, phim.</w:t>
       </w:r>
     </w:p>
     <w:p>
@@ -17516,7 +16822,7 @@
                 <w:sz w:val="26"/>
                 <w:szCs w:val="26"/>
               </w:rPr>
-              <w:t xml:space="preserve">- Kích thích tư duy: sinh viên cúi người chạm ngón chân trước và sau 30 giây giữ căng, nhận xét sự thay đổi.</w:t>
+              <w:t xml:space="preserve">- Câu hỏi mở về vai trò của kéo dãn.</w:t>
             </w:r>
           </w:p>
           <w:p>
@@ -17633,21 +16939,7 @@
                 <w:sz w:val="26"/>
                 <w:szCs w:val="26"/>
               </w:rPr>
-              <w:t xml:space="preserve">- Thuyết giảng tích cực: tính đàn hồi – nhớt (creep, stress relaxation); phản xạ căng, ức chế tự sinh, ức chế đối vận; dung nạp kéo dãn.</w:t>
-            </w:r>
-          </w:p>
-          <w:p>
-            <w:pPr>
-              <w:spacing w:after="30" w:line="276"/>
-              <w:jc w:val="left"/>
-            </w:pPr>
-            <w:r>
-              <w:rPr>
-                <w:rFonts w:ascii="Times New Roman" w:cs="Times New Roman" w:eastAsia="Times New Roman" w:hAnsi="Times New Roman"/>
-                <w:sz w:val="26"/>
-                <w:szCs w:val="26"/>
-              </w:rPr>
-              <w:t xml:space="preserve">- Câu hỏi động não: giải thích hiện tượng vừa trải nghiệm.</w:t>
+              <w:t xml:space="preserve">- Thuyết giảng tích cực (powerpoint, hình ảnh): cơ chế cơ học và thần kinh.</w:t>
             </w:r>
           </w:p>
         </w:tc>
@@ -17679,7 +16971,7 @@
                 <w:sz w:val="26"/>
                 <w:szCs w:val="26"/>
               </w:rPr>
-              <w:t xml:space="preserve">25 phút</w:t>
+              <w:t xml:space="preserve">20 phút</w:t>
             </w:r>
           </w:p>
         </w:tc>
@@ -17718,7 +17010,7 @@
                 <w:sz w:val="26"/>
                 <w:szCs w:val="26"/>
               </w:rPr>
-              <w:t xml:space="preserve">3. Phân loại và thông số</w:t>
+              <w:t xml:space="preserve">3. Phân loại và thông số kéo dãn</w:t>
             </w:r>
           </w:p>
         </w:tc>
@@ -17750,21 +17042,7 @@
                 <w:sz w:val="26"/>
                 <w:szCs w:val="26"/>
               </w:rPr>
-              <w:t xml:space="preserve">- Thuyết giảng: kéo dãn tĩnh, động, nảy, thụ động, chủ động, tự kéo dãn, theo nguyên lý PNF (giữ – nghỉ, co – nghỉ).</w:t>
-            </w:r>
-          </w:p>
-          <w:p>
-            <w:pPr>
-              <w:spacing w:after="30" w:line="276"/>
-              <w:jc w:val="left"/>
-            </w:pPr>
-            <w:r>
-              <w:rPr>
-                <w:rFonts w:ascii="Times New Roman" w:cs="Times New Roman" w:eastAsia="Times New Roman" w:hAnsi="Times New Roman"/>
-                <w:sz w:val="26"/>
-                <w:szCs w:val="26"/>
-              </w:rPr>
-              <w:t xml:space="preserve">- Thảo luận nhóm đôi (2 phút): chọn loại kéo dãn cho vận động viên trước thi đấu và cho người bệnh co rút sau bất động.</w:t>
+              <w:t xml:space="preserve">- Thuyết giảng; trò chơi trả lời nhanh.</w:t>
             </w:r>
           </w:p>
         </w:tc>
@@ -17835,7 +17113,7 @@
                 <w:sz w:val="26"/>
                 <w:szCs w:val="26"/>
               </w:rPr>
-              <w:t xml:space="preserve">4. Chỉ định, chống chỉ định và kỹ thuật</w:t>
+              <w:t xml:space="preserve">4. Chỉ định, chống chỉ định; kỹ thuật và nguyên tắc an toàn</w:t>
             </w:r>
           </w:p>
         </w:tc>
@@ -17867,7 +17145,7 @@
                 <w:sz w:val="26"/>
                 <w:szCs w:val="26"/>
               </w:rPr>
-              <w:t xml:space="preserve">- Thuyết giảng: chỉ định, chống chỉ định, nguyên tắc an toàn.</w:t>
+              <w:t xml:space="preserve">- Thuyết giảng kết hợp phim minh họa kỹ thuật kéo dãn các nhóm cơ chính.</w:t>
             </w:r>
           </w:p>
           <w:p>
@@ -17881,7 +17159,7 @@
                 <w:sz w:val="26"/>
                 <w:szCs w:val="26"/>
               </w:rPr>
-              <w:t xml:space="preserve">- Video &amp; trực quan: kéo dãn cơ ụ ngồi cẳng chân, cơ tam đầu cẳng chân, cơ gập háng; phân tích tư thế cố định.</w:t>
+              <w:t xml:space="preserve">- Học nhóm – nghiên cứu tình huống: lựa chọn kỹ thuật cho bệnh nhân giả định; đại diện trình bày.</w:t>
             </w:r>
           </w:p>
         </w:tc>
@@ -17913,7 +17191,7 @@
                 <w:sz w:val="26"/>
                 <w:szCs w:val="26"/>
               </w:rPr>
-              <w:t xml:space="preserve">20 phút</w:t>
+              <w:t xml:space="preserve">45 phút</w:t>
             </w:r>
           </w:p>
         </w:tc>
@@ -17952,7 +17230,7 @@
                 <w:sz w:val="26"/>
                 <w:szCs w:val="26"/>
               </w:rPr>
-              <w:t xml:space="preserve">5. Dạy học dựa trên tình huống (CBL)</w:t>
+              <w:t xml:space="preserve">5. Tổng kết và Lượng giá tại lớp</w:t>
             </w:r>
           </w:p>
         </w:tc>
@@ -17984,64 +17262,9 @@
                 <w:sz w:val="26"/>
                 <w:szCs w:val="26"/>
               </w:rPr>
-              <w:t xml:space="preserve">- Ca lâm sàng ngắn cơ ụ ngồi cẳng chân: nhóm đề xuất kỹ thuật, thông số và chương trình tự tập; giảng viên phản hồi.</w:t>
-            </w:r>
-          </w:p>
-        </w:tc>
-        <w:tc>
-          <w:tcPr>
-            <w:tcW w:type="dxa" w:w="1100"/>
-            <w:tcBorders>
-              <w:top w:val="single" w:color="000000" w:sz="4"/>
-              <w:left w:val="single" w:color="000000" w:sz="4"/>
-              <w:bottom w:val="single" w:color="000000" w:sz="4"/>
-              <w:right w:val="single" w:color="000000" w:sz="4"/>
-            </w:tcBorders>
-            <w:tcMar>
-              <w:top w:type="dxa" w:w="50"/>
-              <w:left w:type="dxa" w:w="90"/>
-              <w:bottom w:type="dxa" w:w="50"/>
-              <w:right w:type="dxa" w:w="90"/>
-            </w:tcMar>
-            <w:vAlign w:val="center"/>
-          </w:tcPr>
-          <w:p>
-            <w:pPr>
-              <w:spacing w:after="30" w:line="276"/>
-              <w:jc w:val="center"/>
-            </w:pPr>
-            <w:r>
-              <w:rPr>
-                <w:rFonts w:ascii="Times New Roman" w:cs="Times New Roman" w:eastAsia="Times New Roman" w:hAnsi="Times New Roman"/>
-                <w:sz w:val="26"/>
-                <w:szCs w:val="26"/>
-              </w:rPr>
-              <w:t xml:space="preserve">20 phút</w:t>
-            </w:r>
-          </w:p>
-        </w:tc>
-      </w:tr>
-      <w:tr>
-        <w:trPr>
-          <w:cantSplit/>
-        </w:trPr>
-        <w:tc>
-          <w:tcPr>
-            <w:tcW w:type="dxa" w:w="2300"/>
-            <w:tcBorders>
-              <w:top w:val="single" w:color="000000" w:sz="4"/>
-              <w:left w:val="single" w:color="000000" w:sz="4"/>
-              <w:bottom w:val="single" w:color="000000" w:sz="4"/>
-              <w:right w:val="single" w:color="000000" w:sz="4"/>
-            </w:tcBorders>
-            <w:tcMar>
-              <w:top w:type="dxa" w:w="50"/>
-              <w:left w:type="dxa" w:w="90"/>
-              <w:bottom w:type="dxa" w:w="50"/>
-              <w:right w:type="dxa" w:w="90"/>
-            </w:tcMar>
-            <w:vAlign w:val="top"/>
-          </w:tcPr>
+              <w:t xml:space="preserve">- Tóm tắt Phần B bằng sơ đồ tư duy; câu hỏi nhanh.</w:t>
+            </w:r>
+          </w:p>
           <w:p>
             <w:pPr>
               <w:spacing w:after="30" w:line="276"/>
@@ -18050,58 +17273,10 @@
             <w:r>
               <w:rPr>
                 <w:rFonts w:ascii="Times New Roman" w:cs="Times New Roman" w:eastAsia="Times New Roman" w:hAnsi="Times New Roman"/>
-                <w:b/>
-                <w:bCs/>
-                <w:sz w:val="26"/>
-                <w:szCs w:val="26"/>
-              </w:rPr>
-              <w:t xml:space="preserve">6. Tổng kết và Lượng giá tại lớp</w:t>
-            </w:r>
-          </w:p>
-        </w:tc>
-        <w:tc>
-          <w:tcPr>
-            <w:tcW w:type="dxa" w:w="5671"/>
-            <w:tcBorders>
-              <w:top w:val="single" w:color="000000" w:sz="4"/>
-              <w:left w:val="single" w:color="000000" w:sz="4"/>
-              <w:bottom w:val="single" w:color="000000" w:sz="4"/>
-              <w:right w:val="single" w:color="000000" w:sz="4"/>
-            </w:tcBorders>
-            <w:tcMar>
-              <w:top w:type="dxa" w:w="50"/>
-              <w:left w:type="dxa" w:w="90"/>
-              <w:bottom w:type="dxa" w:w="50"/>
-              <w:right w:type="dxa" w:w="90"/>
-            </w:tcMar>
-            <w:vAlign w:val="top"/>
-          </w:tcPr>
-          <w:p>
-            <w:pPr>
-              <w:spacing w:after="30" w:line="276"/>
-              <w:jc w:val="left"/>
-            </w:pPr>
-            <w:r>
-              <w:rPr>
-                <w:rFonts w:ascii="Times New Roman" w:cs="Times New Roman" w:eastAsia="Times New Roman" w:hAnsi="Times New Roman"/>
-                <w:sz w:val="26"/>
-                <w:szCs w:val="26"/>
-              </w:rPr>
-              <w:t xml:space="preserve">- Sơ đồ tổng hợp Phần B; lượng giá nhanh 3 câu MCQ.</w:t>
-            </w:r>
-          </w:p>
-          <w:p>
-            <w:pPr>
-              <w:spacing w:after="30" w:line="276"/>
-              <w:jc w:val="left"/>
-            </w:pPr>
-            <w:r>
-              <w:rPr>
-                <w:rFonts w:ascii="Times New Roman" w:cs="Times New Roman" w:eastAsia="Times New Roman" w:hAnsi="Times New Roman"/>
-                <w:sz w:val="26"/>
-                <w:szCs w:val="26"/>
-              </w:rPr>
-              <w:t xml:space="preserve">- Dặn dò ôn tập Phần A, B để chuẩn bị LT1 và TH1.</w:t>
+                <w:sz w:val="26"/>
+                <w:szCs w:val="26"/>
+              </w:rPr>
+              <w:t xml:space="preserve">- Dặn dò ôn tập Phần A, B chuẩn bị kiểm tra.</w:t>
             </w:r>
           </w:p>
         </w:tc>

</xml_diff>